<commit_message>
actualizacion final del entregable 2
</commit_message>
<xml_diff>
--- a/DOCUMENTACION/ENTREGABLE #3.docx
+++ b/DOCUMENTACION/ENTREGABLE #3.docx
@@ -3225,7 +3225,27 @@
                 <w:bCs/>
                 <w:noProof/>
               </w:rPr>
-              <w:t>RF-016 DASHBOARD GERENCIAL</w:t>
+              <w:t>RF-016 DASHBOAR</w:t>
+            </w:r>
+            <w:r>
+              <w:rPr>
+                <w:rStyle w:val="Hipervnculo"/>
+                <w:rFonts w:cstheme="minorHAnsi"/>
+                <w:b/>
+                <w:bCs/>
+                <w:noProof/>
+              </w:rPr>
+              <w:t>D</w:t>
+            </w:r>
+            <w:r>
+              <w:rPr>
+                <w:rStyle w:val="Hipervnculo"/>
+                <w:rFonts w:cstheme="minorHAnsi"/>
+                <w:b/>
+                <w:bCs/>
+                <w:noProof/>
+              </w:rPr>
+              <w:t xml:space="preserve"> GERENCIAL</w:t>
             </w:r>
             <w:r>
               <w:rPr>
@@ -5774,9 +5794,26 @@
     <w:p>
       <w:pPr>
         <w:pStyle w:val="Ttulo1"/>
+        <w:jc w:val="center"/>
+        <w:rPr>
+          <w:rFonts w:asciiTheme="minorHAnsi" w:hAnsiTheme="minorHAnsi" w:cstheme="minorHAnsi"/>
+          <w:b/>
+          <w:bCs/>
+          <w:color w:val="000000" w:themeColor="text1"/>
+          <w:sz w:val="24"/>
+          <w:szCs w:val="24"/>
+        </w:rPr>
       </w:pPr>
       <w:bookmarkStart w:id="3" w:name="_Toc231374838"/>
       <w:r>
+        <w:rPr>
+          <w:rFonts w:asciiTheme="minorHAnsi" w:hAnsiTheme="minorHAnsi" w:cstheme="minorHAnsi"/>
+          <w:b/>
+          <w:bCs/>
+          <w:color w:val="000000" w:themeColor="text1"/>
+          <w:sz w:val="24"/>
+          <w:szCs w:val="24"/>
+        </w:rPr>
         <w:t>INTRODUCCIÓN</w:t>
       </w:r>
       <w:bookmarkEnd w:id="3"/>
@@ -5788,10 +5825,7 @@
         <w:jc w:val="both"/>
       </w:pPr>
       <w:r>
-        <w:t xml:space="preserve">El presente documento corresponde al levantamiento de requerimientos del proyecto profesional informático denominado SIGEPAN (Sistema Integral de Gestión para Panaderías), </w:t>
-      </w:r>
-      <w:r>
-        <w:t>una solución web diseñada para optimizar y automatizar los procesos administrativos y operativos de una empresa dedicada a la producción y comercialización de productos de panadería.</w:t>
+        <w:t>El presente documento corresponde al análisis y factibilidad de los requerimientos del proyecto profesional informático denominado SIGEPAN (Sistema Integral de Gestión para Panaderías), desarrollado con el propósito de optimizar los procesos administrativos y operativos de una panadería mediante una plataforma web moderna, segura y accesible.</w:t>
       </w:r>
     </w:p>
     <w:p>
@@ -5801,7 +5835,7 @@
         <w:jc w:val="both"/>
       </w:pPr>
       <w:r>
-        <w:t>El levantamiento de requerimientos constituye una etapa fundamental dentro del ciclo de vida del desarrollo de software, ya que permite identificar las necesidades de la empresa, comprender los problemas existentes y definir las funcionalidades que deberá incorporar el sistema para satisfacer los objetivos operativos y administrativos de la organización.</w:t>
+        <w:t>Una vez concluida la etapa de levantamiento de requerimientos, resulta necesario realizar un análisis detallado de cada una de las necesidades identificadas, con el fin de determinar la viabilidad de implementar las funcionalidades solicitadas por la empresa y los requerimientos establecidos por el curso Proyecto Profesional Informático.</w:t>
       </w:r>
     </w:p>
     <w:p>
@@ -5811,7 +5845,13 @@
         <w:jc w:val="both"/>
       </w:pPr>
       <w:r>
-        <w:t>Actualmente, la empresa realiza gran parte de sus procesos mediante registros manuales y herramientas que no permiten un control integral de la información. Esta situación genera dificultades en el seguimiento de ventas, control de inventario, administración de productos, supervisión de movimientos de cajas, control de mermas y generación de reportes para la toma de decisiones.</w:t>
+        <w:t xml:space="preserve">El análisis de factibilidad permite evaluar los recursos tecnológicos, operativos y económicos necesarios para el desarrollo del sistema, verificando </w:t>
+      </w:r>
+      <w:r>
+        <w:t xml:space="preserve">que la solución propuesta pueda implementarse de manera exitosa </w:t>
+      </w:r>
+      <w:r>
+        <w:t>dentro del entorno de trabajo de la organización. Este proceso facilita la identificación de los recursos disponibles, las posibles limitaciones existentes y las acciones requeridas para garantizar el cumplimiento de los objetivos del proyecto.</w:t>
       </w:r>
     </w:p>
     <w:p>
@@ -5821,7 +5861,7 @@
         <w:jc w:val="both"/>
       </w:pPr>
       <w:r>
-        <w:t>Con el desarrollo de SIGEPAN se busca centralizar la información de la empresa en una única plataforma web, permitiendo gestionar usuarios, roles, sucursales, productos, inventario, ventas, aperturas y cierres de caja, registro de mermas, reportes operativos y herramientas de análisis mediante indicadores gerenciales.</w:t>
+        <w:t>Para el desarrollo de SIGEPAN se utilizarán tecnologías modernas como Python, Django y MySQL, bajo una arquitectura Cliente/ Servidor, permitiendo construir una solución escalable, segura y adaptable a las necesidades actuales y futuras de la empresa. Asimismo, se contempla la implementación de mecanismos de seguridad, control de accesos, administración de usuarios, gestión de inventario, ventas, cajas y reportes gerenciales.</w:t>
       </w:r>
     </w:p>
     <w:p>
@@ -5831,34 +5871,8 @@
         <w:jc w:val="both"/>
       </w:pPr>
       <w:r>
-        <w:t>El sistema será desarrollado utilizando Python como lenguaje de programación, el framework Django para la lógica de negocio y MySQL como gesto</w:t>
+        <w:t>En este documento se presenta la evaluación de la factibilidad técnica, operacional y económica del proyecto, así como un análisis resumido de cada uno de los requerimientos funcionales y no funcionales definidos en la etapa anterior, con el objetivo de demostrar que el sistema puede desarrollarse y ponerse en funcionamiento satisfactoriamente dentro de la empresa.</w:t>
       </w:r>
-      <w:r>
-        <w:t>r</w:t>
-      </w:r>
-      <w:r>
-        <w:t xml:space="preserve"> de base de datos. Además, se implementará una arquitectura Cliente/ Servidor basada en una arquitectura por Capas, garantizando una solución escalable, segura y mantenible.</w:t>
-      </w:r>
-    </w:p>
-    <w:p>
-      <w:pPr>
-        <w:spacing w:line="360" w:lineRule="auto"/>
-        <w:ind w:firstLine="360"/>
-        <w:jc w:val="both"/>
-      </w:pPr>
-      <w:r>
-        <w:t>La implementación de SIGEPAN permitirá mejorar la eficiencia operativa de la empresa, reducir errores en los procesos administrativos, fortalecer el control de la información y proporcionar herramientas que faciliten la toma de decisiones</w:t>
-      </w:r>
-      <w:r>
-        <w:t xml:space="preserve"> estratégicas para el crecimiento del negocio.</w:t>
-      </w:r>
-    </w:p>
-    <w:p>
-      <w:pPr>
-        <w:spacing w:line="360" w:lineRule="auto"/>
-        <w:ind w:firstLine="360"/>
-        <w:jc w:val="both"/>
-      </w:pPr>
     </w:p>
     <w:p>
       <w:pPr>
@@ -5918,6 +5932,7 @@
           <w:sz w:val="24"/>
           <w:szCs w:val="24"/>
         </w:rPr>
+        <w:lastRenderedPageBreak/>
         <w:t>ANÁLIS</w:t>
       </w:r>
       <w:r>
@@ -5935,10 +5950,138 @@
     </w:p>
     <w:p>
       <w:pPr>
+        <w:ind w:firstLine="360"/>
+      </w:pPr>
+      <w:r>
+        <w:t>El análisis y factibilidad de los requerimientos es una etapa fundamental dentro del ciclo de vida del desarrollo del software</w:t>
+      </w:r>
+      <w:r>
+        <w:t>, ya que permite evaluar si las necesidades identificadas durante el levantamiento de requerimientos pueden ser implementadas de manera satisfactoria dentro de las condiciones actuales de la empresa.</w:t>
+      </w:r>
+    </w:p>
+    <w:p>
+      <w:pPr>
+        <w:ind w:firstLine="360"/>
+      </w:pPr>
+      <w:r>
+        <w:t>Mediante este proceso se analiza cada uno de los requerimientos funcionales y no funcionales definidos para el sistema SIGEPAN, verificando la disponibilidad de recursos tecnológicos, operativos y económicos necesarios para su desarrollo e implementación.</w:t>
+      </w:r>
+    </w:p>
+    <w:p>
+      <w:pPr>
+        <w:ind w:firstLine="360"/>
+      </w:pPr>
+      <w:r>
+        <w:t>La finalidad de este análisis es determinar la viabilidad del proyecto, identificar posibles limitaciones y establecer las condiciones necesarias para garantizar el correcto funcionamiento del sistema una vez puesto en producción.</w:t>
+      </w:r>
+    </w:p>
+    <w:p>
+      <w:pPr>
+        <w:ind w:firstLine="360"/>
+      </w:pPr>
+      <w:r>
+        <w:t>Para el proyecto SIGEPAN se realizará el análisis de factibilidad desde tres perspectivas principales:</w:t>
+      </w:r>
+    </w:p>
+    <w:p>
+      <w:pPr>
+        <w:pStyle w:val="Prrafodelista"/>
+        <w:numPr>
+          <w:ilvl w:val="0"/>
+          <w:numId w:val="45"/>
+        </w:numPr>
+      </w:pPr>
+      <w:r>
+        <w:t>Factibilidad técnica.</w:t>
+      </w:r>
+    </w:p>
+    <w:p>
+      <w:pPr>
+        <w:pStyle w:val="Prrafodelista"/>
+        <w:numPr>
+          <w:ilvl w:val="0"/>
+          <w:numId w:val="45"/>
+        </w:numPr>
+      </w:pPr>
+      <w:r>
+        <w:t>Factibilidad operacional</w:t>
+      </w:r>
+    </w:p>
+    <w:p>
+      <w:pPr>
+        <w:pStyle w:val="Prrafodelista"/>
+        <w:numPr>
+          <w:ilvl w:val="0"/>
+          <w:numId w:val="45"/>
+        </w:numPr>
+      </w:pPr>
+      <w:r>
+        <w:t>Factibilidad económica</w:t>
+      </w:r>
+    </w:p>
+    <w:p/>
+    <w:p>
+      <w:pPr>
+        <w:ind w:firstLine="708"/>
+      </w:pPr>
+      <w:r>
+        <w:t>La factibilidad técnica permitirá evaluar la disponibilidad y adecuación de los recursos de hardware, software y comunicaciones requeridos para el desarrollo y funcionamiento del sistema.</w:t>
+      </w:r>
+    </w:p>
+    <w:p>
+      <w:r>
+        <w:tab/>
+        <w:t xml:space="preserve">La factibilidad operacional analizará la capacidad de la empresa para adoptar el sistema dentro de sus procesos diarios y el nivel de aceptación por parte de los usuarios que utilizaran la aplicación. </w:t>
+      </w:r>
+    </w:p>
+    <w:p>
+      <w:r>
+        <w:tab/>
+        <w:t>Por último, la factibilidad económica determinara los costos asociados al desarrollo e implementación del sistema, comparándolos con los beneficios esperados para la organización.</w:t>
+      </w:r>
+    </w:p>
+    <w:p>
+      <w:pPr>
+        <w:ind w:firstLine="360"/>
+      </w:pPr>
+    </w:p>
+    <w:p>
+      <w:pPr>
+        <w:ind w:firstLine="360"/>
+      </w:pPr>
+    </w:p>
+    <w:p>
+      <w:pPr>
+        <w:ind w:firstLine="360"/>
+      </w:pPr>
+    </w:p>
+    <w:p>
+      <w:pPr>
+        <w:ind w:firstLine="360"/>
+      </w:pPr>
+    </w:p>
+    <w:p>
+      <w:pPr>
         <w:pStyle w:val="Ttulo2"/>
+        <w:rPr>
+          <w:rFonts w:asciiTheme="minorHAnsi" w:hAnsiTheme="minorHAnsi" w:cstheme="minorHAnsi"/>
+          <w:b/>
+          <w:bCs/>
+          <w:color w:val="000000" w:themeColor="text1"/>
+          <w:sz w:val="24"/>
+          <w:szCs w:val="24"/>
+        </w:rPr>
       </w:pPr>
       <w:bookmarkStart w:id="5" w:name="_Toc231374840"/>
       <w:r>
+        <w:rPr>
+          <w:rFonts w:asciiTheme="minorHAnsi" w:hAnsiTheme="minorHAnsi" w:cstheme="minorHAnsi"/>
+          <w:b/>
+          <w:bCs/>
+          <w:color w:val="000000" w:themeColor="text1"/>
+          <w:sz w:val="24"/>
+          <w:szCs w:val="24"/>
+        </w:rPr>
         <w:t>FACTIBILIDAD TECNICA</w:t>
       </w:r>
       <w:bookmarkEnd w:id="5"/>
@@ -5997,6 +6140,7 @@
       </w:pPr>
       <w:bookmarkStart w:id="10" w:name="_Toc231374845"/>
       <w:r>
+        <w:lastRenderedPageBreak/>
         <w:t>FACTIBILIDAD ECONOMICA</w:t>
       </w:r>
       <w:bookmarkEnd w:id="10"/>
@@ -6278,7 +6422,6 @@
         <w:jc w:val="both"/>
       </w:pPr>
       <w:r>
-        <w:lastRenderedPageBreak/>
         <w:t xml:space="preserve">Los requerimientos presentados a continuación han sido </w:t>
       </w:r>
       <w:r>
@@ -6899,317 +7042,317 @@
               <w:jc w:val="both"/>
             </w:pPr>
             <w:r>
+              <w:t>Nombre completo</w:t>
+            </w:r>
+          </w:p>
+        </w:tc>
+        <w:tc>
+          <w:tcPr>
+            <w:tcW w:w="4981" w:type="dxa"/>
+          </w:tcPr>
+          <w:p>
+            <w:pPr>
+              <w:spacing w:line="360" w:lineRule="auto"/>
+              <w:jc w:val="both"/>
+            </w:pPr>
+            <w:r>
+              <w:t>Nombre el usuario</w:t>
+            </w:r>
+          </w:p>
+        </w:tc>
+      </w:tr>
+      <w:tr>
+        <w:tc>
+          <w:tcPr>
+            <w:tcW w:w="4981" w:type="dxa"/>
+            <w:gridSpan w:val="2"/>
+          </w:tcPr>
+          <w:p>
+            <w:pPr>
+              <w:spacing w:line="360" w:lineRule="auto"/>
+              <w:jc w:val="both"/>
+            </w:pPr>
+            <w:r>
+              <w:t>Correo electrónico</w:t>
+            </w:r>
+          </w:p>
+        </w:tc>
+        <w:tc>
+          <w:tcPr>
+            <w:tcW w:w="4981" w:type="dxa"/>
+          </w:tcPr>
+          <w:p>
+            <w:pPr>
+              <w:spacing w:line="360" w:lineRule="auto"/>
+              <w:jc w:val="both"/>
+            </w:pPr>
+            <w:r>
+              <w:t>Correo del usuario</w:t>
+            </w:r>
+          </w:p>
+        </w:tc>
+      </w:tr>
+      <w:tr>
+        <w:tc>
+          <w:tcPr>
+            <w:tcW w:w="4981" w:type="dxa"/>
+            <w:gridSpan w:val="2"/>
+          </w:tcPr>
+          <w:p>
+            <w:pPr>
+              <w:spacing w:line="360" w:lineRule="auto"/>
+              <w:jc w:val="both"/>
+            </w:pPr>
+            <w:r>
+              <w:t>Usuario</w:t>
+            </w:r>
+          </w:p>
+        </w:tc>
+        <w:tc>
+          <w:tcPr>
+            <w:tcW w:w="4981" w:type="dxa"/>
+          </w:tcPr>
+          <w:p>
+            <w:pPr>
+              <w:spacing w:line="360" w:lineRule="auto"/>
+              <w:jc w:val="both"/>
+            </w:pPr>
+            <w:r>
+              <w:t>Nombre de acceso</w:t>
+            </w:r>
+          </w:p>
+        </w:tc>
+      </w:tr>
+      <w:tr>
+        <w:tc>
+          <w:tcPr>
+            <w:tcW w:w="4981" w:type="dxa"/>
+            <w:gridSpan w:val="2"/>
+          </w:tcPr>
+          <w:p>
+            <w:pPr>
+              <w:spacing w:line="360" w:lineRule="auto"/>
+              <w:jc w:val="both"/>
+            </w:pPr>
+            <w:r>
+              <w:t>Contraseña</w:t>
+            </w:r>
+          </w:p>
+        </w:tc>
+        <w:tc>
+          <w:tcPr>
+            <w:tcW w:w="4981" w:type="dxa"/>
+          </w:tcPr>
+          <w:p>
+            <w:pPr>
+              <w:spacing w:line="360" w:lineRule="auto"/>
+              <w:jc w:val="both"/>
+            </w:pPr>
+            <w:r>
+              <w:t>Contraseña encriptada</w:t>
+            </w:r>
+          </w:p>
+        </w:tc>
+      </w:tr>
+      <w:tr>
+        <w:tc>
+          <w:tcPr>
+            <w:tcW w:w="4981" w:type="dxa"/>
+            <w:gridSpan w:val="2"/>
+          </w:tcPr>
+          <w:p>
+            <w:pPr>
+              <w:spacing w:line="360" w:lineRule="auto"/>
+              <w:jc w:val="both"/>
+            </w:pPr>
+            <w:r>
+              <w:t>Rol</w:t>
+            </w:r>
+          </w:p>
+        </w:tc>
+        <w:tc>
+          <w:tcPr>
+            <w:tcW w:w="4981" w:type="dxa"/>
+          </w:tcPr>
+          <w:p>
+            <w:pPr>
+              <w:spacing w:line="360" w:lineRule="auto"/>
+              <w:jc w:val="both"/>
+            </w:pPr>
+            <w:r>
+              <w:t>Rol asignado</w:t>
+            </w:r>
+          </w:p>
+        </w:tc>
+      </w:tr>
+      <w:tr>
+        <w:tc>
+          <w:tcPr>
+            <w:tcW w:w="4981" w:type="dxa"/>
+            <w:gridSpan w:val="2"/>
+          </w:tcPr>
+          <w:p>
+            <w:pPr>
+              <w:spacing w:line="360" w:lineRule="auto"/>
+              <w:jc w:val="both"/>
+            </w:pPr>
+            <w:r>
+              <w:t>Estado</w:t>
+            </w:r>
+          </w:p>
+        </w:tc>
+        <w:tc>
+          <w:tcPr>
+            <w:tcW w:w="4981" w:type="dxa"/>
+          </w:tcPr>
+          <w:p>
+            <w:pPr>
+              <w:spacing w:line="360" w:lineRule="auto"/>
+              <w:jc w:val="both"/>
+            </w:pPr>
+            <w:r>
+              <w:t>Activo/ inactivo</w:t>
+            </w:r>
+          </w:p>
+        </w:tc>
+      </w:tr>
+      <w:tr>
+        <w:tc>
+          <w:tcPr>
+            <w:tcW w:w="4981" w:type="dxa"/>
+            <w:gridSpan w:val="2"/>
+          </w:tcPr>
+          <w:p>
+            <w:pPr>
+              <w:spacing w:line="360" w:lineRule="auto"/>
+              <w:jc w:val="both"/>
+            </w:pPr>
+            <w:r>
+              <w:t>Botón nuevo</w:t>
+            </w:r>
+          </w:p>
+        </w:tc>
+        <w:tc>
+          <w:tcPr>
+            <w:tcW w:w="4981" w:type="dxa"/>
+          </w:tcPr>
+          <w:p>
+            <w:pPr>
+              <w:spacing w:line="360" w:lineRule="auto"/>
+              <w:jc w:val="both"/>
+            </w:pPr>
+            <w:r>
+              <w:t>Crear usuario</w:t>
+            </w:r>
+          </w:p>
+        </w:tc>
+      </w:tr>
+      <w:tr>
+        <w:tc>
+          <w:tcPr>
+            <w:tcW w:w="4981" w:type="dxa"/>
+            <w:gridSpan w:val="2"/>
+          </w:tcPr>
+          <w:p>
+            <w:pPr>
+              <w:spacing w:line="360" w:lineRule="auto"/>
+              <w:jc w:val="both"/>
+            </w:pPr>
+            <w:r>
+              <w:t>Botón guardar</w:t>
+            </w:r>
+          </w:p>
+        </w:tc>
+        <w:tc>
+          <w:tcPr>
+            <w:tcW w:w="4981" w:type="dxa"/>
+          </w:tcPr>
+          <w:p>
+            <w:pPr>
+              <w:spacing w:line="360" w:lineRule="auto"/>
+              <w:jc w:val="both"/>
+            </w:pPr>
+            <w:r>
+              <w:t>Guardar usuario</w:t>
+            </w:r>
+          </w:p>
+        </w:tc>
+      </w:tr>
+      <w:tr>
+        <w:tc>
+          <w:tcPr>
+            <w:tcW w:w="4981" w:type="dxa"/>
+            <w:gridSpan w:val="2"/>
+          </w:tcPr>
+          <w:p>
+            <w:pPr>
+              <w:spacing w:line="360" w:lineRule="auto"/>
+              <w:jc w:val="both"/>
+            </w:pPr>
+            <w:r>
+              <w:t>Botón modificar</w:t>
+            </w:r>
+          </w:p>
+        </w:tc>
+        <w:tc>
+          <w:tcPr>
+            <w:tcW w:w="4981" w:type="dxa"/>
+          </w:tcPr>
+          <w:p>
+            <w:pPr>
+              <w:spacing w:line="360" w:lineRule="auto"/>
+              <w:jc w:val="both"/>
+            </w:pPr>
+            <w:r>
+              <w:t>Editar usuario</w:t>
+            </w:r>
+          </w:p>
+        </w:tc>
+      </w:tr>
+      <w:tr>
+        <w:tc>
+          <w:tcPr>
+            <w:tcW w:w="4981" w:type="dxa"/>
+            <w:gridSpan w:val="2"/>
+          </w:tcPr>
+          <w:p>
+            <w:pPr>
+              <w:spacing w:line="360" w:lineRule="auto"/>
+              <w:jc w:val="both"/>
+            </w:pPr>
+            <w:r>
+              <w:t>Botón buscar</w:t>
+            </w:r>
+          </w:p>
+        </w:tc>
+        <w:tc>
+          <w:tcPr>
+            <w:tcW w:w="4981" w:type="dxa"/>
+          </w:tcPr>
+          <w:p>
+            <w:pPr>
+              <w:spacing w:line="360" w:lineRule="auto"/>
+              <w:jc w:val="both"/>
+            </w:pPr>
+            <w:r>
+              <w:t>Buscar usuario</w:t>
+            </w:r>
+          </w:p>
+        </w:tc>
+      </w:tr>
+      <w:tr>
+        <w:tc>
+          <w:tcPr>
+            <w:tcW w:w="4981" w:type="dxa"/>
+            <w:gridSpan w:val="2"/>
+          </w:tcPr>
+          <w:p>
+            <w:pPr>
+              <w:spacing w:line="360" w:lineRule="auto"/>
+              <w:jc w:val="both"/>
+            </w:pPr>
+            <w:r>
               <w:lastRenderedPageBreak/>
-              <w:t>Nombre completo</w:t>
-            </w:r>
-          </w:p>
-        </w:tc>
-        <w:tc>
-          <w:tcPr>
-            <w:tcW w:w="4981" w:type="dxa"/>
-          </w:tcPr>
-          <w:p>
-            <w:pPr>
-              <w:spacing w:line="360" w:lineRule="auto"/>
-              <w:jc w:val="both"/>
-            </w:pPr>
-            <w:r>
-              <w:t>Nombre el usuario</w:t>
-            </w:r>
-          </w:p>
-        </w:tc>
-      </w:tr>
-      <w:tr>
-        <w:tc>
-          <w:tcPr>
-            <w:tcW w:w="4981" w:type="dxa"/>
-            <w:gridSpan w:val="2"/>
-          </w:tcPr>
-          <w:p>
-            <w:pPr>
-              <w:spacing w:line="360" w:lineRule="auto"/>
-              <w:jc w:val="both"/>
-            </w:pPr>
-            <w:r>
-              <w:t>Correo electrónico</w:t>
-            </w:r>
-          </w:p>
-        </w:tc>
-        <w:tc>
-          <w:tcPr>
-            <w:tcW w:w="4981" w:type="dxa"/>
-          </w:tcPr>
-          <w:p>
-            <w:pPr>
-              <w:spacing w:line="360" w:lineRule="auto"/>
-              <w:jc w:val="both"/>
-            </w:pPr>
-            <w:r>
-              <w:t>Correo del usuario</w:t>
-            </w:r>
-          </w:p>
-        </w:tc>
-      </w:tr>
-      <w:tr>
-        <w:tc>
-          <w:tcPr>
-            <w:tcW w:w="4981" w:type="dxa"/>
-            <w:gridSpan w:val="2"/>
-          </w:tcPr>
-          <w:p>
-            <w:pPr>
-              <w:spacing w:line="360" w:lineRule="auto"/>
-              <w:jc w:val="both"/>
-            </w:pPr>
-            <w:r>
-              <w:t>Usuario</w:t>
-            </w:r>
-          </w:p>
-        </w:tc>
-        <w:tc>
-          <w:tcPr>
-            <w:tcW w:w="4981" w:type="dxa"/>
-          </w:tcPr>
-          <w:p>
-            <w:pPr>
-              <w:spacing w:line="360" w:lineRule="auto"/>
-              <w:jc w:val="both"/>
-            </w:pPr>
-            <w:r>
-              <w:t>Nombre de acceso</w:t>
-            </w:r>
-          </w:p>
-        </w:tc>
-      </w:tr>
-      <w:tr>
-        <w:tc>
-          <w:tcPr>
-            <w:tcW w:w="4981" w:type="dxa"/>
-            <w:gridSpan w:val="2"/>
-          </w:tcPr>
-          <w:p>
-            <w:pPr>
-              <w:spacing w:line="360" w:lineRule="auto"/>
-              <w:jc w:val="both"/>
-            </w:pPr>
-            <w:r>
-              <w:t>Contraseña</w:t>
-            </w:r>
-          </w:p>
-        </w:tc>
-        <w:tc>
-          <w:tcPr>
-            <w:tcW w:w="4981" w:type="dxa"/>
-          </w:tcPr>
-          <w:p>
-            <w:pPr>
-              <w:spacing w:line="360" w:lineRule="auto"/>
-              <w:jc w:val="both"/>
-            </w:pPr>
-            <w:r>
-              <w:t>Contraseña encriptada</w:t>
-            </w:r>
-          </w:p>
-        </w:tc>
-      </w:tr>
-      <w:tr>
-        <w:tc>
-          <w:tcPr>
-            <w:tcW w:w="4981" w:type="dxa"/>
-            <w:gridSpan w:val="2"/>
-          </w:tcPr>
-          <w:p>
-            <w:pPr>
-              <w:spacing w:line="360" w:lineRule="auto"/>
-              <w:jc w:val="both"/>
-            </w:pPr>
-            <w:r>
-              <w:t>Rol</w:t>
-            </w:r>
-          </w:p>
-        </w:tc>
-        <w:tc>
-          <w:tcPr>
-            <w:tcW w:w="4981" w:type="dxa"/>
-          </w:tcPr>
-          <w:p>
-            <w:pPr>
-              <w:spacing w:line="360" w:lineRule="auto"/>
-              <w:jc w:val="both"/>
-            </w:pPr>
-            <w:r>
-              <w:t>Rol asignado</w:t>
-            </w:r>
-          </w:p>
-        </w:tc>
-      </w:tr>
-      <w:tr>
-        <w:tc>
-          <w:tcPr>
-            <w:tcW w:w="4981" w:type="dxa"/>
-            <w:gridSpan w:val="2"/>
-          </w:tcPr>
-          <w:p>
-            <w:pPr>
-              <w:spacing w:line="360" w:lineRule="auto"/>
-              <w:jc w:val="both"/>
-            </w:pPr>
-            <w:r>
-              <w:t>Estado</w:t>
-            </w:r>
-          </w:p>
-        </w:tc>
-        <w:tc>
-          <w:tcPr>
-            <w:tcW w:w="4981" w:type="dxa"/>
-          </w:tcPr>
-          <w:p>
-            <w:pPr>
-              <w:spacing w:line="360" w:lineRule="auto"/>
-              <w:jc w:val="both"/>
-            </w:pPr>
-            <w:r>
-              <w:t>Activo/ inactivo</w:t>
-            </w:r>
-          </w:p>
-        </w:tc>
-      </w:tr>
-      <w:tr>
-        <w:tc>
-          <w:tcPr>
-            <w:tcW w:w="4981" w:type="dxa"/>
-            <w:gridSpan w:val="2"/>
-          </w:tcPr>
-          <w:p>
-            <w:pPr>
-              <w:spacing w:line="360" w:lineRule="auto"/>
-              <w:jc w:val="both"/>
-            </w:pPr>
-            <w:r>
-              <w:t>Botón nuevo</w:t>
-            </w:r>
-          </w:p>
-        </w:tc>
-        <w:tc>
-          <w:tcPr>
-            <w:tcW w:w="4981" w:type="dxa"/>
-          </w:tcPr>
-          <w:p>
-            <w:pPr>
-              <w:spacing w:line="360" w:lineRule="auto"/>
-              <w:jc w:val="both"/>
-            </w:pPr>
-            <w:r>
-              <w:t>Crear usuario</w:t>
-            </w:r>
-          </w:p>
-        </w:tc>
-      </w:tr>
-      <w:tr>
-        <w:tc>
-          <w:tcPr>
-            <w:tcW w:w="4981" w:type="dxa"/>
-            <w:gridSpan w:val="2"/>
-          </w:tcPr>
-          <w:p>
-            <w:pPr>
-              <w:spacing w:line="360" w:lineRule="auto"/>
-              <w:jc w:val="both"/>
-            </w:pPr>
-            <w:r>
-              <w:t>Botón guardar</w:t>
-            </w:r>
-          </w:p>
-        </w:tc>
-        <w:tc>
-          <w:tcPr>
-            <w:tcW w:w="4981" w:type="dxa"/>
-          </w:tcPr>
-          <w:p>
-            <w:pPr>
-              <w:spacing w:line="360" w:lineRule="auto"/>
-              <w:jc w:val="both"/>
-            </w:pPr>
-            <w:r>
-              <w:t>Guardar usuario</w:t>
-            </w:r>
-          </w:p>
-        </w:tc>
-      </w:tr>
-      <w:tr>
-        <w:tc>
-          <w:tcPr>
-            <w:tcW w:w="4981" w:type="dxa"/>
-            <w:gridSpan w:val="2"/>
-          </w:tcPr>
-          <w:p>
-            <w:pPr>
-              <w:spacing w:line="360" w:lineRule="auto"/>
-              <w:jc w:val="both"/>
-            </w:pPr>
-            <w:r>
-              <w:t>Botón modificar</w:t>
-            </w:r>
-          </w:p>
-        </w:tc>
-        <w:tc>
-          <w:tcPr>
-            <w:tcW w:w="4981" w:type="dxa"/>
-          </w:tcPr>
-          <w:p>
-            <w:pPr>
-              <w:spacing w:line="360" w:lineRule="auto"/>
-              <w:jc w:val="both"/>
-            </w:pPr>
-            <w:r>
-              <w:t>Editar usuario</w:t>
-            </w:r>
-          </w:p>
-        </w:tc>
-      </w:tr>
-      <w:tr>
-        <w:tc>
-          <w:tcPr>
-            <w:tcW w:w="4981" w:type="dxa"/>
-            <w:gridSpan w:val="2"/>
-          </w:tcPr>
-          <w:p>
-            <w:pPr>
-              <w:spacing w:line="360" w:lineRule="auto"/>
-              <w:jc w:val="both"/>
-            </w:pPr>
-            <w:r>
-              <w:t>Botón buscar</w:t>
-            </w:r>
-          </w:p>
-        </w:tc>
-        <w:tc>
-          <w:tcPr>
-            <w:tcW w:w="4981" w:type="dxa"/>
-          </w:tcPr>
-          <w:p>
-            <w:pPr>
-              <w:spacing w:line="360" w:lineRule="auto"/>
-              <w:jc w:val="both"/>
-            </w:pPr>
-            <w:r>
-              <w:t>Buscar usuario</w:t>
-            </w:r>
-          </w:p>
-        </w:tc>
-      </w:tr>
-      <w:tr>
-        <w:tc>
-          <w:tcPr>
-            <w:tcW w:w="4981" w:type="dxa"/>
-            <w:gridSpan w:val="2"/>
-          </w:tcPr>
-          <w:p>
-            <w:pPr>
-              <w:spacing w:line="360" w:lineRule="auto"/>
-              <w:jc w:val="both"/>
-            </w:pPr>
-            <w:r>
               <w:t>Botón deshabilitar</w:t>
             </w:r>
           </w:p>
@@ -7890,7 +8033,6 @@
                 <w:b/>
                 <w:bCs/>
               </w:rPr>
-              <w:lastRenderedPageBreak/>
               <w:t>Objeto</w:t>
             </w:r>
           </w:p>
@@ -8195,6 +8337,7 @@
           <w:bCs/>
           <w:color w:val="000000" w:themeColor="text1"/>
         </w:rPr>
+        <w:lastRenderedPageBreak/>
         <w:t>RF-005 GESTION DE SUCURSALES</w:t>
       </w:r>
       <w:bookmarkEnd w:id="23"/>
@@ -8898,7 +9041,6 @@
               <w:jc w:val="both"/>
             </w:pPr>
             <w:r>
-              <w:lastRenderedPageBreak/>
               <w:t>Descripción</w:t>
             </w:r>
           </w:p>
@@ -9160,6 +9302,7 @@
           <w:bCs/>
           <w:color w:val="000000" w:themeColor="text1"/>
         </w:rPr>
+        <w:lastRenderedPageBreak/>
         <w:t>RF-007 GESTION DE PRODUCTOS</w:t>
       </w:r>
       <w:bookmarkEnd w:id="25"/>
@@ -9835,7 +9978,6 @@
           <w:bCs/>
           <w:color w:val="000000" w:themeColor="text1"/>
         </w:rPr>
-        <w:lastRenderedPageBreak/>
         <w:t>RF-008 REGISTRO DE VENTAS</w:t>
       </w:r>
       <w:bookmarkEnd w:id="26"/>
@@ -10131,6 +10273,7 @@
               <w:jc w:val="both"/>
             </w:pPr>
             <w:r>
+              <w:lastRenderedPageBreak/>
               <w:t>Precio unitario</w:t>
             </w:r>
           </w:p>
@@ -10773,7 +10916,6 @@
               <w:jc w:val="both"/>
             </w:pPr>
             <w:r>
-              <w:lastRenderedPageBreak/>
               <w:t>Botón modificar</w:t>
             </w:r>
           </w:p>
@@ -11070,6 +11212,7 @@
               <w:jc w:val="both"/>
             </w:pPr>
             <w:r>
+              <w:lastRenderedPageBreak/>
               <w:t>Usuario</w:t>
             </w:r>
           </w:p>
@@ -11650,7 +11793,6 @@
               <w:jc w:val="both"/>
             </w:pPr>
             <w:r>
-              <w:lastRenderedPageBreak/>
               <w:t>Diferencia</w:t>
             </w:r>
           </w:p>
@@ -11947,6 +12089,7 @@
               <w:jc w:val="both"/>
             </w:pPr>
             <w:r>
+              <w:lastRenderedPageBreak/>
               <w:t>Producto</w:t>
             </w:r>
           </w:p>
@@ -12646,7 +12789,6 @@
                 <w:b/>
                 <w:bCs/>
               </w:rPr>
-              <w:lastRenderedPageBreak/>
               <w:t>Descripción</w:t>
             </w:r>
           </w:p>
@@ -12950,6 +13092,7 @@
           <w:bCs/>
           <w:color w:val="000000" w:themeColor="text1"/>
         </w:rPr>
+        <w:lastRenderedPageBreak/>
         <w:t>RF-015 REPORTE OPERATIVOS</w:t>
       </w:r>
       <w:bookmarkEnd w:id="33"/>
@@ -13577,7 +13720,6 @@
           <w:bCs/>
           <w:color w:val="000000" w:themeColor="text1"/>
         </w:rPr>
-        <w:lastRenderedPageBreak/>
         <w:t>RF-016 DASHBOARD GERENCIAL</w:t>
       </w:r>
       <w:bookmarkEnd w:id="34"/>
@@ -13897,6 +14039,7 @@
               <w:jc w:val="both"/>
             </w:pPr>
             <w:r>
+              <w:lastRenderedPageBreak/>
               <w:t>Ventas sucursales</w:t>
             </w:r>
           </w:p>
@@ -14588,267 +14731,267 @@
                 <w:b/>
                 <w:bCs/>
               </w:rPr>
+              <w:t>Objeto</w:t>
+            </w:r>
+          </w:p>
+        </w:tc>
+        <w:tc>
+          <w:tcPr>
+            <w:tcW w:w="4981" w:type="dxa"/>
+          </w:tcPr>
+          <w:p>
+            <w:pPr>
+              <w:spacing w:line="360" w:lineRule="auto"/>
+              <w:jc w:val="both"/>
+              <w:rPr>
+                <w:b/>
+                <w:bCs/>
+              </w:rPr>
+            </w:pPr>
+            <w:r>
+              <w:rPr>
+                <w:b/>
+                <w:bCs/>
+              </w:rPr>
+              <w:t>Descripción</w:t>
+            </w:r>
+          </w:p>
+        </w:tc>
+      </w:tr>
+      <w:tr>
+        <w:tc>
+          <w:tcPr>
+            <w:tcW w:w="4981" w:type="dxa"/>
+            <w:gridSpan w:val="2"/>
+          </w:tcPr>
+          <w:p>
+            <w:pPr>
+              <w:spacing w:line="360" w:lineRule="auto"/>
+              <w:jc w:val="both"/>
+            </w:pPr>
+            <w:r>
+              <w:t>Usuario</w:t>
+            </w:r>
+          </w:p>
+        </w:tc>
+        <w:tc>
+          <w:tcPr>
+            <w:tcW w:w="4981" w:type="dxa"/>
+          </w:tcPr>
+          <w:p>
+            <w:pPr>
+              <w:spacing w:line="360" w:lineRule="auto"/>
+              <w:jc w:val="both"/>
+            </w:pPr>
+            <w:r>
+              <w:t>Responsable</w:t>
+            </w:r>
+          </w:p>
+        </w:tc>
+      </w:tr>
+      <w:tr>
+        <w:tc>
+          <w:tcPr>
+            <w:tcW w:w="4981" w:type="dxa"/>
+            <w:gridSpan w:val="2"/>
+          </w:tcPr>
+          <w:p>
+            <w:pPr>
+              <w:spacing w:line="360" w:lineRule="auto"/>
+              <w:jc w:val="both"/>
+            </w:pPr>
+            <w:r>
+              <w:t>Fecha</w:t>
+            </w:r>
+          </w:p>
+        </w:tc>
+        <w:tc>
+          <w:tcPr>
+            <w:tcW w:w="4981" w:type="dxa"/>
+          </w:tcPr>
+          <w:p>
+            <w:pPr>
+              <w:spacing w:line="360" w:lineRule="auto"/>
+              <w:jc w:val="both"/>
+            </w:pPr>
+            <w:r>
+              <w:t>Fecha movimiento</w:t>
+            </w:r>
+          </w:p>
+        </w:tc>
+      </w:tr>
+      <w:tr>
+        <w:tc>
+          <w:tcPr>
+            <w:tcW w:w="4981" w:type="dxa"/>
+            <w:gridSpan w:val="2"/>
+          </w:tcPr>
+          <w:p>
+            <w:pPr>
+              <w:spacing w:line="360" w:lineRule="auto"/>
+              <w:jc w:val="both"/>
+            </w:pPr>
+            <w:r>
+              <w:t>Tipo movimiento</w:t>
+            </w:r>
+          </w:p>
+        </w:tc>
+        <w:tc>
+          <w:tcPr>
+            <w:tcW w:w="4981" w:type="dxa"/>
+          </w:tcPr>
+          <w:p>
+            <w:pPr>
+              <w:spacing w:line="360" w:lineRule="auto"/>
+              <w:jc w:val="both"/>
+            </w:pPr>
+            <w:r>
+              <w:t>Acción realizada</w:t>
+            </w:r>
+            <w:r>
+              <w:t xml:space="preserve"> (ventas, mermas, ajustes, entradas de inventario, usuarios, productos, entre otros).</w:t>
+            </w:r>
+          </w:p>
+        </w:tc>
+      </w:tr>
+      <w:tr>
+        <w:tc>
+          <w:tcPr>
+            <w:tcW w:w="4981" w:type="dxa"/>
+            <w:gridSpan w:val="2"/>
+          </w:tcPr>
+          <w:p>
+            <w:pPr>
+              <w:spacing w:line="360" w:lineRule="auto"/>
+              <w:jc w:val="both"/>
+            </w:pPr>
+            <w:r>
+              <w:t>Detalle</w:t>
+            </w:r>
+          </w:p>
+        </w:tc>
+        <w:tc>
+          <w:tcPr>
+            <w:tcW w:w="4981" w:type="dxa"/>
+          </w:tcPr>
+          <w:p>
+            <w:pPr>
+              <w:spacing w:line="360" w:lineRule="auto"/>
+              <w:jc w:val="both"/>
+            </w:pPr>
+            <w:r>
+              <w:t>Descripción</w:t>
+            </w:r>
+          </w:p>
+        </w:tc>
+      </w:tr>
+      <w:tr>
+        <w:tc>
+          <w:tcPr>
+            <w:tcW w:w="4981" w:type="dxa"/>
+            <w:gridSpan w:val="2"/>
+          </w:tcPr>
+          <w:p>
+            <w:pPr>
+              <w:spacing w:line="360" w:lineRule="auto"/>
+              <w:jc w:val="both"/>
+            </w:pPr>
+            <w:r>
+              <w:t>Modulo</w:t>
+            </w:r>
+          </w:p>
+        </w:tc>
+        <w:tc>
+          <w:tcPr>
+            <w:tcW w:w="4981" w:type="dxa"/>
+          </w:tcPr>
+          <w:p>
+            <w:pPr>
+              <w:spacing w:line="360" w:lineRule="auto"/>
+              <w:jc w:val="both"/>
+            </w:pPr>
+            <w:r>
+              <w:t>Área afectada</w:t>
+            </w:r>
+          </w:p>
+        </w:tc>
+      </w:tr>
+      <w:tr>
+        <w:tc>
+          <w:tcPr>
+            <w:tcW w:w="4981" w:type="dxa"/>
+            <w:gridSpan w:val="2"/>
+          </w:tcPr>
+          <w:p>
+            <w:pPr>
+              <w:spacing w:line="360" w:lineRule="auto"/>
+              <w:jc w:val="both"/>
+            </w:pPr>
+            <w:r>
+              <w:t>Botón consultar</w:t>
+            </w:r>
+          </w:p>
+        </w:tc>
+        <w:tc>
+          <w:tcPr>
+            <w:tcW w:w="4981" w:type="dxa"/>
+          </w:tcPr>
+          <w:p>
+            <w:pPr>
+              <w:spacing w:line="360" w:lineRule="auto"/>
+              <w:jc w:val="both"/>
+            </w:pPr>
+            <w:r>
+              <w:t>Consultar registros</w:t>
+            </w:r>
+          </w:p>
+        </w:tc>
+      </w:tr>
+      <w:tr>
+        <w:tc>
+          <w:tcPr>
+            <w:tcW w:w="4981" w:type="dxa"/>
+            <w:gridSpan w:val="2"/>
+          </w:tcPr>
+          <w:p>
+            <w:pPr>
+              <w:spacing w:line="360" w:lineRule="auto"/>
+              <w:jc w:val="both"/>
+            </w:pPr>
+            <w:bookmarkStart w:id="37" w:name="_Hlk231248190"/>
+            <w:r>
+              <w:t>Exportar PDF</w:t>
+            </w:r>
+          </w:p>
+        </w:tc>
+        <w:tc>
+          <w:tcPr>
+            <w:tcW w:w="4981" w:type="dxa"/>
+          </w:tcPr>
+          <w:p>
+            <w:pPr>
+              <w:spacing w:line="360" w:lineRule="auto"/>
+              <w:jc w:val="both"/>
+            </w:pPr>
+            <w:r>
+              <w:t>Generar reporte</w:t>
+            </w:r>
+          </w:p>
+        </w:tc>
+      </w:tr>
+      <w:tr>
+        <w:tc>
+          <w:tcPr>
+            <w:tcW w:w="4981" w:type="dxa"/>
+            <w:gridSpan w:val="2"/>
+          </w:tcPr>
+          <w:p>
+            <w:pPr>
+              <w:spacing w:line="360" w:lineRule="auto"/>
+              <w:jc w:val="both"/>
+            </w:pPr>
+            <w:r>
               <w:lastRenderedPageBreak/>
-              <w:t>Objeto</w:t>
-            </w:r>
-          </w:p>
-        </w:tc>
-        <w:tc>
-          <w:tcPr>
-            <w:tcW w:w="4981" w:type="dxa"/>
-          </w:tcPr>
-          <w:p>
-            <w:pPr>
-              <w:spacing w:line="360" w:lineRule="auto"/>
-              <w:jc w:val="both"/>
-              <w:rPr>
-                <w:b/>
-                <w:bCs/>
-              </w:rPr>
-            </w:pPr>
-            <w:r>
-              <w:rPr>
-                <w:b/>
-                <w:bCs/>
-              </w:rPr>
-              <w:t>Descripción</w:t>
-            </w:r>
-          </w:p>
-        </w:tc>
-      </w:tr>
-      <w:tr>
-        <w:tc>
-          <w:tcPr>
-            <w:tcW w:w="4981" w:type="dxa"/>
-            <w:gridSpan w:val="2"/>
-          </w:tcPr>
-          <w:p>
-            <w:pPr>
-              <w:spacing w:line="360" w:lineRule="auto"/>
-              <w:jc w:val="both"/>
-            </w:pPr>
-            <w:r>
-              <w:t>Usuario</w:t>
-            </w:r>
-          </w:p>
-        </w:tc>
-        <w:tc>
-          <w:tcPr>
-            <w:tcW w:w="4981" w:type="dxa"/>
-          </w:tcPr>
-          <w:p>
-            <w:pPr>
-              <w:spacing w:line="360" w:lineRule="auto"/>
-              <w:jc w:val="both"/>
-            </w:pPr>
-            <w:r>
-              <w:t>Responsable</w:t>
-            </w:r>
-          </w:p>
-        </w:tc>
-      </w:tr>
-      <w:tr>
-        <w:tc>
-          <w:tcPr>
-            <w:tcW w:w="4981" w:type="dxa"/>
-            <w:gridSpan w:val="2"/>
-          </w:tcPr>
-          <w:p>
-            <w:pPr>
-              <w:spacing w:line="360" w:lineRule="auto"/>
-              <w:jc w:val="both"/>
-            </w:pPr>
-            <w:r>
-              <w:t>Fecha</w:t>
-            </w:r>
-          </w:p>
-        </w:tc>
-        <w:tc>
-          <w:tcPr>
-            <w:tcW w:w="4981" w:type="dxa"/>
-          </w:tcPr>
-          <w:p>
-            <w:pPr>
-              <w:spacing w:line="360" w:lineRule="auto"/>
-              <w:jc w:val="both"/>
-            </w:pPr>
-            <w:r>
-              <w:t>Fecha movimiento</w:t>
-            </w:r>
-          </w:p>
-        </w:tc>
-      </w:tr>
-      <w:tr>
-        <w:tc>
-          <w:tcPr>
-            <w:tcW w:w="4981" w:type="dxa"/>
-            <w:gridSpan w:val="2"/>
-          </w:tcPr>
-          <w:p>
-            <w:pPr>
-              <w:spacing w:line="360" w:lineRule="auto"/>
-              <w:jc w:val="both"/>
-            </w:pPr>
-            <w:r>
-              <w:t>Tipo movimiento</w:t>
-            </w:r>
-          </w:p>
-        </w:tc>
-        <w:tc>
-          <w:tcPr>
-            <w:tcW w:w="4981" w:type="dxa"/>
-          </w:tcPr>
-          <w:p>
-            <w:pPr>
-              <w:spacing w:line="360" w:lineRule="auto"/>
-              <w:jc w:val="both"/>
-            </w:pPr>
-            <w:r>
-              <w:t>Acción realizada</w:t>
-            </w:r>
-            <w:r>
-              <w:t xml:space="preserve"> (ventas, mermas, ajustes, entradas de inventario, usuarios, productos, entre otros).</w:t>
-            </w:r>
-          </w:p>
-        </w:tc>
-      </w:tr>
-      <w:tr>
-        <w:tc>
-          <w:tcPr>
-            <w:tcW w:w="4981" w:type="dxa"/>
-            <w:gridSpan w:val="2"/>
-          </w:tcPr>
-          <w:p>
-            <w:pPr>
-              <w:spacing w:line="360" w:lineRule="auto"/>
-              <w:jc w:val="both"/>
-            </w:pPr>
-            <w:r>
-              <w:t>Detalle</w:t>
-            </w:r>
-          </w:p>
-        </w:tc>
-        <w:tc>
-          <w:tcPr>
-            <w:tcW w:w="4981" w:type="dxa"/>
-          </w:tcPr>
-          <w:p>
-            <w:pPr>
-              <w:spacing w:line="360" w:lineRule="auto"/>
-              <w:jc w:val="both"/>
-            </w:pPr>
-            <w:r>
-              <w:t>Descripción</w:t>
-            </w:r>
-          </w:p>
-        </w:tc>
-      </w:tr>
-      <w:tr>
-        <w:tc>
-          <w:tcPr>
-            <w:tcW w:w="4981" w:type="dxa"/>
-            <w:gridSpan w:val="2"/>
-          </w:tcPr>
-          <w:p>
-            <w:pPr>
-              <w:spacing w:line="360" w:lineRule="auto"/>
-              <w:jc w:val="both"/>
-            </w:pPr>
-            <w:r>
-              <w:t>Modulo</w:t>
-            </w:r>
-          </w:p>
-        </w:tc>
-        <w:tc>
-          <w:tcPr>
-            <w:tcW w:w="4981" w:type="dxa"/>
-          </w:tcPr>
-          <w:p>
-            <w:pPr>
-              <w:spacing w:line="360" w:lineRule="auto"/>
-              <w:jc w:val="both"/>
-            </w:pPr>
-            <w:r>
-              <w:t>Área afectada</w:t>
-            </w:r>
-          </w:p>
-        </w:tc>
-      </w:tr>
-      <w:tr>
-        <w:tc>
-          <w:tcPr>
-            <w:tcW w:w="4981" w:type="dxa"/>
-            <w:gridSpan w:val="2"/>
-          </w:tcPr>
-          <w:p>
-            <w:pPr>
-              <w:spacing w:line="360" w:lineRule="auto"/>
-              <w:jc w:val="both"/>
-            </w:pPr>
-            <w:r>
-              <w:t>Botón consultar</w:t>
-            </w:r>
-          </w:p>
-        </w:tc>
-        <w:tc>
-          <w:tcPr>
-            <w:tcW w:w="4981" w:type="dxa"/>
-          </w:tcPr>
-          <w:p>
-            <w:pPr>
-              <w:spacing w:line="360" w:lineRule="auto"/>
-              <w:jc w:val="both"/>
-            </w:pPr>
-            <w:r>
-              <w:t>Consultar registros</w:t>
-            </w:r>
-          </w:p>
-        </w:tc>
-      </w:tr>
-      <w:tr>
-        <w:tc>
-          <w:tcPr>
-            <w:tcW w:w="4981" w:type="dxa"/>
-            <w:gridSpan w:val="2"/>
-          </w:tcPr>
-          <w:p>
-            <w:pPr>
-              <w:spacing w:line="360" w:lineRule="auto"/>
-              <w:jc w:val="both"/>
-            </w:pPr>
-            <w:bookmarkStart w:id="37" w:name="_Hlk231248190"/>
-            <w:r>
-              <w:t>Exportar PDF</w:t>
-            </w:r>
-          </w:p>
-        </w:tc>
-        <w:tc>
-          <w:tcPr>
-            <w:tcW w:w="4981" w:type="dxa"/>
-          </w:tcPr>
-          <w:p>
-            <w:pPr>
-              <w:spacing w:line="360" w:lineRule="auto"/>
-              <w:jc w:val="both"/>
-            </w:pPr>
-            <w:r>
-              <w:t>Generar reporte</w:t>
-            </w:r>
-          </w:p>
-        </w:tc>
-      </w:tr>
-      <w:tr>
-        <w:tc>
-          <w:tcPr>
-            <w:tcW w:w="4981" w:type="dxa"/>
-            <w:gridSpan w:val="2"/>
-          </w:tcPr>
-          <w:p>
-            <w:pPr>
-              <w:spacing w:line="360" w:lineRule="auto"/>
-              <w:jc w:val="both"/>
-            </w:pPr>
-            <w:r>
               <w:t>Exportar Excel</w:t>
             </w:r>
           </w:p>
@@ -15507,272 +15650,272 @@
                 <w:b/>
                 <w:bCs/>
               </w:rPr>
+              <w:t>Descripción</w:t>
+            </w:r>
+          </w:p>
+        </w:tc>
+        <w:tc>
+          <w:tcPr>
+            <w:tcW w:w="8407" w:type="dxa"/>
+            <w:gridSpan w:val="2"/>
+          </w:tcPr>
+          <w:p>
+            <w:pPr>
+              <w:spacing w:line="360" w:lineRule="auto"/>
+              <w:jc w:val="both"/>
+            </w:pPr>
+            <w:r>
+              <w:t>Permitirá administrar la información tributaria de la empresa para adaptarse al régimen simplificado.</w:t>
+            </w:r>
+          </w:p>
+        </w:tc>
+      </w:tr>
+      <w:tr>
+        <w:tc>
+          <w:tcPr>
+            <w:tcW w:w="4981" w:type="dxa"/>
+            <w:gridSpan w:val="2"/>
+          </w:tcPr>
+          <w:p>
+            <w:pPr>
+              <w:spacing w:line="360" w:lineRule="auto"/>
+              <w:jc w:val="both"/>
+              <w:rPr>
+                <w:b/>
+                <w:bCs/>
+              </w:rPr>
+            </w:pPr>
+            <w:r>
+              <w:rPr>
+                <w:b/>
+                <w:bCs/>
+              </w:rPr>
+              <w:t>Objeto</w:t>
+            </w:r>
+          </w:p>
+        </w:tc>
+        <w:tc>
+          <w:tcPr>
+            <w:tcW w:w="4981" w:type="dxa"/>
+          </w:tcPr>
+          <w:p>
+            <w:pPr>
+              <w:spacing w:line="360" w:lineRule="auto"/>
+              <w:jc w:val="both"/>
+              <w:rPr>
+                <w:b/>
+                <w:bCs/>
+              </w:rPr>
+            </w:pPr>
+            <w:r>
+              <w:rPr>
+                <w:b/>
+                <w:bCs/>
+              </w:rPr>
+              <w:t>Descripción</w:t>
+            </w:r>
+          </w:p>
+        </w:tc>
+      </w:tr>
+      <w:tr>
+        <w:tc>
+          <w:tcPr>
+            <w:tcW w:w="4981" w:type="dxa"/>
+            <w:gridSpan w:val="2"/>
+          </w:tcPr>
+          <w:p>
+            <w:pPr>
+              <w:spacing w:line="360" w:lineRule="auto"/>
+              <w:jc w:val="both"/>
+            </w:pPr>
+            <w:r>
+              <w:t>Nombre comercial</w:t>
+            </w:r>
+          </w:p>
+        </w:tc>
+        <w:tc>
+          <w:tcPr>
+            <w:tcW w:w="4981" w:type="dxa"/>
+          </w:tcPr>
+          <w:p>
+            <w:pPr>
+              <w:spacing w:line="360" w:lineRule="auto"/>
+              <w:jc w:val="both"/>
+            </w:pPr>
+            <w:r>
+              <w:t>Nombre registrado</w:t>
+            </w:r>
+          </w:p>
+        </w:tc>
+      </w:tr>
+      <w:tr>
+        <w:tc>
+          <w:tcPr>
+            <w:tcW w:w="4981" w:type="dxa"/>
+            <w:gridSpan w:val="2"/>
+          </w:tcPr>
+          <w:p>
+            <w:pPr>
+              <w:spacing w:line="360" w:lineRule="auto"/>
+              <w:jc w:val="both"/>
+            </w:pPr>
+            <w:r>
+              <w:t>Cedula jurídica</w:t>
+            </w:r>
+          </w:p>
+        </w:tc>
+        <w:tc>
+          <w:tcPr>
+            <w:tcW w:w="4981" w:type="dxa"/>
+          </w:tcPr>
+          <w:p>
+            <w:pPr>
+              <w:spacing w:line="360" w:lineRule="auto"/>
+              <w:jc w:val="both"/>
+            </w:pPr>
+            <w:r>
+              <w:t>Identificación jurídica</w:t>
+            </w:r>
+          </w:p>
+        </w:tc>
+      </w:tr>
+      <w:tr>
+        <w:tc>
+          <w:tcPr>
+            <w:tcW w:w="4981" w:type="dxa"/>
+            <w:gridSpan w:val="2"/>
+          </w:tcPr>
+          <w:p>
+            <w:pPr>
+              <w:spacing w:line="360" w:lineRule="auto"/>
+              <w:jc w:val="both"/>
+            </w:pPr>
+            <w:r>
+              <w:t>Régimen tributario</w:t>
+            </w:r>
+          </w:p>
+        </w:tc>
+        <w:tc>
+          <w:tcPr>
+            <w:tcW w:w="4981" w:type="dxa"/>
+          </w:tcPr>
+          <w:p>
+            <w:pPr>
+              <w:spacing w:line="360" w:lineRule="auto"/>
+              <w:jc w:val="both"/>
+            </w:pPr>
+            <w:r>
+              <w:t>Simplificado</w:t>
+            </w:r>
+          </w:p>
+        </w:tc>
+      </w:tr>
+      <w:tr>
+        <w:tc>
+          <w:tcPr>
+            <w:tcW w:w="4981" w:type="dxa"/>
+            <w:gridSpan w:val="2"/>
+          </w:tcPr>
+          <w:p>
+            <w:pPr>
+              <w:spacing w:line="360" w:lineRule="auto"/>
+              <w:jc w:val="both"/>
+            </w:pPr>
+            <w:r>
+              <w:t>Dirección fiscal</w:t>
+            </w:r>
+          </w:p>
+        </w:tc>
+        <w:tc>
+          <w:tcPr>
+            <w:tcW w:w="4981" w:type="dxa"/>
+          </w:tcPr>
+          <w:p>
+            <w:pPr>
+              <w:spacing w:line="360" w:lineRule="auto"/>
+              <w:jc w:val="both"/>
+            </w:pPr>
+            <w:r>
+              <w:t>Ubicación registrada</w:t>
+            </w:r>
+          </w:p>
+        </w:tc>
+      </w:tr>
+      <w:tr>
+        <w:tc>
+          <w:tcPr>
+            <w:tcW w:w="4981" w:type="dxa"/>
+            <w:gridSpan w:val="2"/>
+          </w:tcPr>
+          <w:p>
+            <w:pPr>
+              <w:spacing w:line="360" w:lineRule="auto"/>
+              <w:jc w:val="both"/>
+            </w:pPr>
+            <w:r>
+              <w:t xml:space="preserve">Teléfono </w:t>
+            </w:r>
+          </w:p>
+        </w:tc>
+        <w:tc>
+          <w:tcPr>
+            <w:tcW w:w="4981" w:type="dxa"/>
+          </w:tcPr>
+          <w:p>
+            <w:pPr>
+              <w:spacing w:line="360" w:lineRule="auto"/>
+              <w:jc w:val="both"/>
+            </w:pPr>
+            <w:r>
+              <w:t>Contacto</w:t>
+            </w:r>
+          </w:p>
+        </w:tc>
+      </w:tr>
+      <w:tr>
+        <w:tc>
+          <w:tcPr>
+            <w:tcW w:w="4981" w:type="dxa"/>
+            <w:gridSpan w:val="2"/>
+          </w:tcPr>
+          <w:p>
+            <w:pPr>
+              <w:spacing w:line="360" w:lineRule="auto"/>
+              <w:jc w:val="both"/>
+            </w:pPr>
+            <w:r>
+              <w:t>Correo electrónico</w:t>
+            </w:r>
+          </w:p>
+        </w:tc>
+        <w:tc>
+          <w:tcPr>
+            <w:tcW w:w="4981" w:type="dxa"/>
+          </w:tcPr>
+          <w:p>
+            <w:pPr>
+              <w:spacing w:line="360" w:lineRule="auto"/>
+              <w:jc w:val="both"/>
+            </w:pPr>
+            <w:r>
+              <w:t>Correo oficial</w:t>
+            </w:r>
+          </w:p>
+        </w:tc>
+      </w:tr>
+      <w:tr>
+        <w:tc>
+          <w:tcPr>
+            <w:tcW w:w="4981" w:type="dxa"/>
+            <w:gridSpan w:val="2"/>
+          </w:tcPr>
+          <w:p>
+            <w:pPr>
+              <w:spacing w:line="360" w:lineRule="auto"/>
+              <w:jc w:val="both"/>
+            </w:pPr>
+            <w:r>
               <w:lastRenderedPageBreak/>
-              <w:t>Descripción</w:t>
-            </w:r>
-          </w:p>
-        </w:tc>
-        <w:tc>
-          <w:tcPr>
-            <w:tcW w:w="8407" w:type="dxa"/>
-            <w:gridSpan w:val="2"/>
-          </w:tcPr>
-          <w:p>
-            <w:pPr>
-              <w:spacing w:line="360" w:lineRule="auto"/>
-              <w:jc w:val="both"/>
-            </w:pPr>
-            <w:r>
-              <w:t>Permitirá administrar la información tributaria de la empresa para adaptarse al régimen simplificado.</w:t>
-            </w:r>
-          </w:p>
-        </w:tc>
-      </w:tr>
-      <w:tr>
-        <w:tc>
-          <w:tcPr>
-            <w:tcW w:w="4981" w:type="dxa"/>
-            <w:gridSpan w:val="2"/>
-          </w:tcPr>
-          <w:p>
-            <w:pPr>
-              <w:spacing w:line="360" w:lineRule="auto"/>
-              <w:jc w:val="both"/>
-              <w:rPr>
-                <w:b/>
-                <w:bCs/>
-              </w:rPr>
-            </w:pPr>
-            <w:r>
-              <w:rPr>
-                <w:b/>
-                <w:bCs/>
-              </w:rPr>
-              <w:t>Objeto</w:t>
-            </w:r>
-          </w:p>
-        </w:tc>
-        <w:tc>
-          <w:tcPr>
-            <w:tcW w:w="4981" w:type="dxa"/>
-          </w:tcPr>
-          <w:p>
-            <w:pPr>
-              <w:spacing w:line="360" w:lineRule="auto"/>
-              <w:jc w:val="both"/>
-              <w:rPr>
-                <w:b/>
-                <w:bCs/>
-              </w:rPr>
-            </w:pPr>
-            <w:r>
-              <w:rPr>
-                <w:b/>
-                <w:bCs/>
-              </w:rPr>
-              <w:t>Descripción</w:t>
-            </w:r>
-          </w:p>
-        </w:tc>
-      </w:tr>
-      <w:tr>
-        <w:tc>
-          <w:tcPr>
-            <w:tcW w:w="4981" w:type="dxa"/>
-            <w:gridSpan w:val="2"/>
-          </w:tcPr>
-          <w:p>
-            <w:pPr>
-              <w:spacing w:line="360" w:lineRule="auto"/>
-              <w:jc w:val="both"/>
-            </w:pPr>
-            <w:r>
-              <w:t>Nombre comercial</w:t>
-            </w:r>
-          </w:p>
-        </w:tc>
-        <w:tc>
-          <w:tcPr>
-            <w:tcW w:w="4981" w:type="dxa"/>
-          </w:tcPr>
-          <w:p>
-            <w:pPr>
-              <w:spacing w:line="360" w:lineRule="auto"/>
-              <w:jc w:val="both"/>
-            </w:pPr>
-            <w:r>
-              <w:t>Nombre registrado</w:t>
-            </w:r>
-          </w:p>
-        </w:tc>
-      </w:tr>
-      <w:tr>
-        <w:tc>
-          <w:tcPr>
-            <w:tcW w:w="4981" w:type="dxa"/>
-            <w:gridSpan w:val="2"/>
-          </w:tcPr>
-          <w:p>
-            <w:pPr>
-              <w:spacing w:line="360" w:lineRule="auto"/>
-              <w:jc w:val="both"/>
-            </w:pPr>
-            <w:r>
-              <w:t>Cedula jurídica</w:t>
-            </w:r>
-          </w:p>
-        </w:tc>
-        <w:tc>
-          <w:tcPr>
-            <w:tcW w:w="4981" w:type="dxa"/>
-          </w:tcPr>
-          <w:p>
-            <w:pPr>
-              <w:spacing w:line="360" w:lineRule="auto"/>
-              <w:jc w:val="both"/>
-            </w:pPr>
-            <w:r>
-              <w:t>Identificación jurídica</w:t>
-            </w:r>
-          </w:p>
-        </w:tc>
-      </w:tr>
-      <w:tr>
-        <w:tc>
-          <w:tcPr>
-            <w:tcW w:w="4981" w:type="dxa"/>
-            <w:gridSpan w:val="2"/>
-          </w:tcPr>
-          <w:p>
-            <w:pPr>
-              <w:spacing w:line="360" w:lineRule="auto"/>
-              <w:jc w:val="both"/>
-            </w:pPr>
-            <w:r>
-              <w:t>Régimen tributario</w:t>
-            </w:r>
-          </w:p>
-        </w:tc>
-        <w:tc>
-          <w:tcPr>
-            <w:tcW w:w="4981" w:type="dxa"/>
-          </w:tcPr>
-          <w:p>
-            <w:pPr>
-              <w:spacing w:line="360" w:lineRule="auto"/>
-              <w:jc w:val="both"/>
-            </w:pPr>
-            <w:r>
-              <w:t>Simplificado</w:t>
-            </w:r>
-          </w:p>
-        </w:tc>
-      </w:tr>
-      <w:tr>
-        <w:tc>
-          <w:tcPr>
-            <w:tcW w:w="4981" w:type="dxa"/>
-            <w:gridSpan w:val="2"/>
-          </w:tcPr>
-          <w:p>
-            <w:pPr>
-              <w:spacing w:line="360" w:lineRule="auto"/>
-              <w:jc w:val="both"/>
-            </w:pPr>
-            <w:r>
-              <w:t>Dirección fiscal</w:t>
-            </w:r>
-          </w:p>
-        </w:tc>
-        <w:tc>
-          <w:tcPr>
-            <w:tcW w:w="4981" w:type="dxa"/>
-          </w:tcPr>
-          <w:p>
-            <w:pPr>
-              <w:spacing w:line="360" w:lineRule="auto"/>
-              <w:jc w:val="both"/>
-            </w:pPr>
-            <w:r>
-              <w:t>Ubicación registrada</w:t>
-            </w:r>
-          </w:p>
-        </w:tc>
-      </w:tr>
-      <w:tr>
-        <w:tc>
-          <w:tcPr>
-            <w:tcW w:w="4981" w:type="dxa"/>
-            <w:gridSpan w:val="2"/>
-          </w:tcPr>
-          <w:p>
-            <w:pPr>
-              <w:spacing w:line="360" w:lineRule="auto"/>
-              <w:jc w:val="both"/>
-            </w:pPr>
-            <w:r>
-              <w:t xml:space="preserve">Teléfono </w:t>
-            </w:r>
-          </w:p>
-        </w:tc>
-        <w:tc>
-          <w:tcPr>
-            <w:tcW w:w="4981" w:type="dxa"/>
-          </w:tcPr>
-          <w:p>
-            <w:pPr>
-              <w:spacing w:line="360" w:lineRule="auto"/>
-              <w:jc w:val="both"/>
-            </w:pPr>
-            <w:r>
-              <w:t>Contacto</w:t>
-            </w:r>
-          </w:p>
-        </w:tc>
-      </w:tr>
-      <w:tr>
-        <w:tc>
-          <w:tcPr>
-            <w:tcW w:w="4981" w:type="dxa"/>
-            <w:gridSpan w:val="2"/>
-          </w:tcPr>
-          <w:p>
-            <w:pPr>
-              <w:spacing w:line="360" w:lineRule="auto"/>
-              <w:jc w:val="both"/>
-            </w:pPr>
-            <w:r>
-              <w:t>Correo electrónico</w:t>
-            </w:r>
-          </w:p>
-        </w:tc>
-        <w:tc>
-          <w:tcPr>
-            <w:tcW w:w="4981" w:type="dxa"/>
-          </w:tcPr>
-          <w:p>
-            <w:pPr>
-              <w:spacing w:line="360" w:lineRule="auto"/>
-              <w:jc w:val="both"/>
-            </w:pPr>
-            <w:r>
-              <w:t>Correo oficial</w:t>
-            </w:r>
-          </w:p>
-        </w:tc>
-      </w:tr>
-      <w:tr>
-        <w:tc>
-          <w:tcPr>
-            <w:tcW w:w="4981" w:type="dxa"/>
-            <w:gridSpan w:val="2"/>
-          </w:tcPr>
-          <w:p>
-            <w:pPr>
-              <w:spacing w:line="360" w:lineRule="auto"/>
-              <w:jc w:val="both"/>
-            </w:pPr>
-            <w:r>
               <w:t>Botón guardar</w:t>
             </w:r>
           </w:p>
@@ -16488,7 +16631,6 @@
                 <w:b/>
                 <w:bCs/>
               </w:rPr>
-              <w:lastRenderedPageBreak/>
               <w:t>Objeto</w:t>
             </w:r>
           </w:p>
@@ -16791,6 +16933,7 @@
           <w:bCs/>
           <w:color w:val="000000" w:themeColor="text1"/>
         </w:rPr>
+        <w:lastRenderedPageBreak/>
         <w:t>RF-023 REPORTE DE UTILIDAD ESTIMADA</w:t>
       </w:r>
       <w:bookmarkEnd w:id="42"/>
@@ -17491,7 +17634,6 @@
               <w:jc w:val="both"/>
             </w:pPr>
             <w:r>
-              <w:lastRenderedPageBreak/>
               <w:t>Fecha</w:t>
             </w:r>
           </w:p>
@@ -17697,6 +17839,7 @@
           <w:bCs/>
           <w:color w:val="000000" w:themeColor="text1"/>
         </w:rPr>
+        <w:lastRenderedPageBreak/>
         <w:t xml:space="preserve">RF-025 </w:t>
       </w:r>
       <w:r>
@@ -18382,241 +18525,241 @@
                 <w:b/>
                 <w:bCs/>
               </w:rPr>
+              <w:t>Descripción</w:t>
+            </w:r>
+          </w:p>
+        </w:tc>
+        <w:tc>
+          <w:tcPr>
+            <w:tcW w:w="8407" w:type="dxa"/>
+            <w:gridSpan w:val="2"/>
+          </w:tcPr>
+          <w:p>
+            <w:pPr>
+              <w:spacing w:line="360" w:lineRule="auto"/>
+              <w:jc w:val="both"/>
+            </w:pPr>
+            <w:r>
+              <w:t>Permitirá registrar las compras de productos e insumos realizadas por la empresa para llevar control de costos, alimentar el inventario y generar información de apoyo para reportes administrativos y tributarios.</w:t>
+            </w:r>
+          </w:p>
+        </w:tc>
+      </w:tr>
+      <w:tr>
+        <w:tc>
+          <w:tcPr>
+            <w:tcW w:w="4981" w:type="dxa"/>
+            <w:gridSpan w:val="2"/>
+          </w:tcPr>
+          <w:p>
+            <w:pPr>
+              <w:spacing w:line="360" w:lineRule="auto"/>
+              <w:jc w:val="both"/>
+              <w:rPr>
+                <w:b/>
+                <w:bCs/>
+              </w:rPr>
+            </w:pPr>
+            <w:r>
+              <w:rPr>
+                <w:b/>
+                <w:bCs/>
+              </w:rPr>
+              <w:t>Objeto</w:t>
+            </w:r>
+          </w:p>
+        </w:tc>
+        <w:tc>
+          <w:tcPr>
+            <w:tcW w:w="4981" w:type="dxa"/>
+          </w:tcPr>
+          <w:p>
+            <w:pPr>
+              <w:spacing w:line="360" w:lineRule="auto"/>
+              <w:jc w:val="both"/>
+              <w:rPr>
+                <w:b/>
+                <w:bCs/>
+              </w:rPr>
+            </w:pPr>
+            <w:r>
+              <w:rPr>
+                <w:b/>
+                <w:bCs/>
+              </w:rPr>
+              <w:t>Descripción</w:t>
+            </w:r>
+          </w:p>
+        </w:tc>
+      </w:tr>
+      <w:tr>
+        <w:tc>
+          <w:tcPr>
+            <w:tcW w:w="4981" w:type="dxa"/>
+            <w:gridSpan w:val="2"/>
+          </w:tcPr>
+          <w:p>
+            <w:pPr>
+              <w:spacing w:line="360" w:lineRule="auto"/>
+              <w:jc w:val="both"/>
+            </w:pPr>
+            <w:r>
+              <w:t>Fecha compra</w:t>
+            </w:r>
+          </w:p>
+        </w:tc>
+        <w:tc>
+          <w:tcPr>
+            <w:tcW w:w="4981" w:type="dxa"/>
+          </w:tcPr>
+          <w:p>
+            <w:pPr>
+              <w:spacing w:line="360" w:lineRule="auto"/>
+              <w:jc w:val="both"/>
+            </w:pPr>
+            <w:r>
+              <w:t>Fecha de la compra</w:t>
+            </w:r>
+          </w:p>
+        </w:tc>
+      </w:tr>
+      <w:tr>
+        <w:tc>
+          <w:tcPr>
+            <w:tcW w:w="4981" w:type="dxa"/>
+            <w:gridSpan w:val="2"/>
+          </w:tcPr>
+          <w:p>
+            <w:pPr>
+              <w:spacing w:line="360" w:lineRule="auto"/>
+              <w:jc w:val="both"/>
+            </w:pPr>
+            <w:r>
+              <w:t>Numero de comprobante</w:t>
+            </w:r>
+          </w:p>
+        </w:tc>
+        <w:tc>
+          <w:tcPr>
+            <w:tcW w:w="4981" w:type="dxa"/>
+          </w:tcPr>
+          <w:p>
+            <w:pPr>
+              <w:spacing w:line="360" w:lineRule="auto"/>
+              <w:jc w:val="both"/>
+            </w:pPr>
+            <w:r>
+              <w:t>Factura o documento de respaldo</w:t>
+            </w:r>
+          </w:p>
+        </w:tc>
+      </w:tr>
+      <w:tr>
+        <w:tc>
+          <w:tcPr>
+            <w:tcW w:w="4981" w:type="dxa"/>
+            <w:gridSpan w:val="2"/>
+          </w:tcPr>
+          <w:p>
+            <w:pPr>
+              <w:spacing w:line="360" w:lineRule="auto"/>
+              <w:jc w:val="both"/>
+            </w:pPr>
+            <w:r>
+              <w:t>Tipo comprobante</w:t>
+            </w:r>
+          </w:p>
+        </w:tc>
+        <w:tc>
+          <w:tcPr>
+            <w:tcW w:w="4981" w:type="dxa"/>
+          </w:tcPr>
+          <w:p>
+            <w:pPr>
+              <w:spacing w:line="360" w:lineRule="auto"/>
+              <w:jc w:val="both"/>
+            </w:pPr>
+            <w:r>
+              <w:t>Factura, ticket, recibo</w:t>
+            </w:r>
+          </w:p>
+        </w:tc>
+      </w:tr>
+      <w:tr>
+        <w:tc>
+          <w:tcPr>
+            <w:tcW w:w="4981" w:type="dxa"/>
+            <w:gridSpan w:val="2"/>
+          </w:tcPr>
+          <w:p>
+            <w:pPr>
+              <w:spacing w:line="360" w:lineRule="auto"/>
+              <w:jc w:val="both"/>
+            </w:pPr>
+            <w:r>
+              <w:t xml:space="preserve">Proveedor </w:t>
+            </w:r>
+          </w:p>
+        </w:tc>
+        <w:tc>
+          <w:tcPr>
+            <w:tcW w:w="4981" w:type="dxa"/>
+          </w:tcPr>
+          <w:p>
+            <w:pPr>
+              <w:spacing w:line="360" w:lineRule="auto"/>
+              <w:jc w:val="both"/>
+            </w:pPr>
+            <w:r>
+              <w:t>Nombre del proveedor</w:t>
+            </w:r>
+          </w:p>
+        </w:tc>
+      </w:tr>
+      <w:tr>
+        <w:tc>
+          <w:tcPr>
+            <w:tcW w:w="4981" w:type="dxa"/>
+            <w:gridSpan w:val="2"/>
+          </w:tcPr>
+          <w:p>
+            <w:pPr>
+              <w:spacing w:line="360" w:lineRule="auto"/>
+              <w:jc w:val="both"/>
+            </w:pPr>
+            <w:r>
+              <w:t>Producto/ insumo</w:t>
+            </w:r>
+          </w:p>
+        </w:tc>
+        <w:tc>
+          <w:tcPr>
+            <w:tcW w:w="4981" w:type="dxa"/>
+          </w:tcPr>
+          <w:p>
+            <w:pPr>
+              <w:spacing w:line="360" w:lineRule="auto"/>
+              <w:jc w:val="both"/>
+            </w:pPr>
+            <w:r>
+              <w:t>Articulo adquirido</w:t>
+            </w:r>
+          </w:p>
+        </w:tc>
+      </w:tr>
+      <w:tr>
+        <w:tc>
+          <w:tcPr>
+            <w:tcW w:w="4981" w:type="dxa"/>
+            <w:gridSpan w:val="2"/>
+          </w:tcPr>
+          <w:p>
+            <w:pPr>
+              <w:spacing w:line="360" w:lineRule="auto"/>
+              <w:jc w:val="both"/>
+            </w:pPr>
+            <w:r>
               <w:lastRenderedPageBreak/>
-              <w:t>Descripción</w:t>
-            </w:r>
-          </w:p>
-        </w:tc>
-        <w:tc>
-          <w:tcPr>
-            <w:tcW w:w="8407" w:type="dxa"/>
-            <w:gridSpan w:val="2"/>
-          </w:tcPr>
-          <w:p>
-            <w:pPr>
-              <w:spacing w:line="360" w:lineRule="auto"/>
-              <w:jc w:val="both"/>
-            </w:pPr>
-            <w:r>
-              <w:t>Permitirá registrar las compras de productos e insumos realizadas por la empresa para llevar control de costos, alimentar el inventario y generar información de apoyo para reportes administrativos y tributarios.</w:t>
-            </w:r>
-          </w:p>
-        </w:tc>
-      </w:tr>
-      <w:tr>
-        <w:tc>
-          <w:tcPr>
-            <w:tcW w:w="4981" w:type="dxa"/>
-            <w:gridSpan w:val="2"/>
-          </w:tcPr>
-          <w:p>
-            <w:pPr>
-              <w:spacing w:line="360" w:lineRule="auto"/>
-              <w:jc w:val="both"/>
-              <w:rPr>
-                <w:b/>
-                <w:bCs/>
-              </w:rPr>
-            </w:pPr>
-            <w:r>
-              <w:rPr>
-                <w:b/>
-                <w:bCs/>
-              </w:rPr>
-              <w:t>Objeto</w:t>
-            </w:r>
-          </w:p>
-        </w:tc>
-        <w:tc>
-          <w:tcPr>
-            <w:tcW w:w="4981" w:type="dxa"/>
-          </w:tcPr>
-          <w:p>
-            <w:pPr>
-              <w:spacing w:line="360" w:lineRule="auto"/>
-              <w:jc w:val="both"/>
-              <w:rPr>
-                <w:b/>
-                <w:bCs/>
-              </w:rPr>
-            </w:pPr>
-            <w:r>
-              <w:rPr>
-                <w:b/>
-                <w:bCs/>
-              </w:rPr>
-              <w:t>Descripción</w:t>
-            </w:r>
-          </w:p>
-        </w:tc>
-      </w:tr>
-      <w:tr>
-        <w:tc>
-          <w:tcPr>
-            <w:tcW w:w="4981" w:type="dxa"/>
-            <w:gridSpan w:val="2"/>
-          </w:tcPr>
-          <w:p>
-            <w:pPr>
-              <w:spacing w:line="360" w:lineRule="auto"/>
-              <w:jc w:val="both"/>
-            </w:pPr>
-            <w:r>
-              <w:t>Fecha compra</w:t>
-            </w:r>
-          </w:p>
-        </w:tc>
-        <w:tc>
-          <w:tcPr>
-            <w:tcW w:w="4981" w:type="dxa"/>
-          </w:tcPr>
-          <w:p>
-            <w:pPr>
-              <w:spacing w:line="360" w:lineRule="auto"/>
-              <w:jc w:val="both"/>
-            </w:pPr>
-            <w:r>
-              <w:t>Fecha de la compra</w:t>
-            </w:r>
-          </w:p>
-        </w:tc>
-      </w:tr>
-      <w:tr>
-        <w:tc>
-          <w:tcPr>
-            <w:tcW w:w="4981" w:type="dxa"/>
-            <w:gridSpan w:val="2"/>
-          </w:tcPr>
-          <w:p>
-            <w:pPr>
-              <w:spacing w:line="360" w:lineRule="auto"/>
-              <w:jc w:val="both"/>
-            </w:pPr>
-            <w:r>
-              <w:t>Numero de comprobante</w:t>
-            </w:r>
-          </w:p>
-        </w:tc>
-        <w:tc>
-          <w:tcPr>
-            <w:tcW w:w="4981" w:type="dxa"/>
-          </w:tcPr>
-          <w:p>
-            <w:pPr>
-              <w:spacing w:line="360" w:lineRule="auto"/>
-              <w:jc w:val="both"/>
-            </w:pPr>
-            <w:r>
-              <w:t>Factura o documento de respaldo</w:t>
-            </w:r>
-          </w:p>
-        </w:tc>
-      </w:tr>
-      <w:tr>
-        <w:tc>
-          <w:tcPr>
-            <w:tcW w:w="4981" w:type="dxa"/>
-            <w:gridSpan w:val="2"/>
-          </w:tcPr>
-          <w:p>
-            <w:pPr>
-              <w:spacing w:line="360" w:lineRule="auto"/>
-              <w:jc w:val="both"/>
-            </w:pPr>
-            <w:r>
-              <w:t>Tipo comprobante</w:t>
-            </w:r>
-          </w:p>
-        </w:tc>
-        <w:tc>
-          <w:tcPr>
-            <w:tcW w:w="4981" w:type="dxa"/>
-          </w:tcPr>
-          <w:p>
-            <w:pPr>
-              <w:spacing w:line="360" w:lineRule="auto"/>
-              <w:jc w:val="both"/>
-            </w:pPr>
-            <w:r>
-              <w:t>Factura, ticket, recibo</w:t>
-            </w:r>
-          </w:p>
-        </w:tc>
-      </w:tr>
-      <w:tr>
-        <w:tc>
-          <w:tcPr>
-            <w:tcW w:w="4981" w:type="dxa"/>
-            <w:gridSpan w:val="2"/>
-          </w:tcPr>
-          <w:p>
-            <w:pPr>
-              <w:spacing w:line="360" w:lineRule="auto"/>
-              <w:jc w:val="both"/>
-            </w:pPr>
-            <w:r>
-              <w:t xml:space="preserve">Proveedor </w:t>
-            </w:r>
-          </w:p>
-        </w:tc>
-        <w:tc>
-          <w:tcPr>
-            <w:tcW w:w="4981" w:type="dxa"/>
-          </w:tcPr>
-          <w:p>
-            <w:pPr>
-              <w:spacing w:line="360" w:lineRule="auto"/>
-              <w:jc w:val="both"/>
-            </w:pPr>
-            <w:r>
-              <w:t>Nombre del proveedor</w:t>
-            </w:r>
-          </w:p>
-        </w:tc>
-      </w:tr>
-      <w:tr>
-        <w:tc>
-          <w:tcPr>
-            <w:tcW w:w="4981" w:type="dxa"/>
-            <w:gridSpan w:val="2"/>
-          </w:tcPr>
-          <w:p>
-            <w:pPr>
-              <w:spacing w:line="360" w:lineRule="auto"/>
-              <w:jc w:val="both"/>
-            </w:pPr>
-            <w:r>
-              <w:t>Producto/ insumo</w:t>
-            </w:r>
-          </w:p>
-        </w:tc>
-        <w:tc>
-          <w:tcPr>
-            <w:tcW w:w="4981" w:type="dxa"/>
-          </w:tcPr>
-          <w:p>
-            <w:pPr>
-              <w:spacing w:line="360" w:lineRule="auto"/>
-              <w:jc w:val="both"/>
-            </w:pPr>
-            <w:r>
-              <w:t>Articulo adquirido</w:t>
-            </w:r>
-          </w:p>
-        </w:tc>
-      </w:tr>
-      <w:tr>
-        <w:tc>
-          <w:tcPr>
-            <w:tcW w:w="4981" w:type="dxa"/>
-            <w:gridSpan w:val="2"/>
-          </w:tcPr>
-          <w:p>
-            <w:pPr>
-              <w:spacing w:line="360" w:lineRule="auto"/>
-              <w:jc w:val="both"/>
-            </w:pPr>
-            <w:r>
               <w:t>Cantidad</w:t>
             </w:r>
           </w:p>
@@ -19189,7 +19332,6 @@
           <w:bCs/>
           <w:color w:val="000000" w:themeColor="text1"/>
         </w:rPr>
-        <w:lastRenderedPageBreak/>
         <w:t>RNF-002 NAVEGADOR WEB</w:t>
       </w:r>
       <w:bookmarkEnd w:id="48"/>
@@ -19506,6 +19648,7 @@
           <w:bCs/>
           <w:color w:val="000000" w:themeColor="text1"/>
         </w:rPr>
+        <w:lastRenderedPageBreak/>
         <w:t>RNF-003 LENGUAJE DE PROGRAMACION</w:t>
       </w:r>
       <w:bookmarkEnd w:id="49"/>
@@ -20263,7 +20406,6 @@
                 <w:b/>
                 <w:bCs/>
               </w:rPr>
-              <w:lastRenderedPageBreak/>
               <w:t>Descripción</w:t>
             </w:r>
           </w:p>
@@ -20486,6 +20628,7 @@
           <w:bCs/>
           <w:color w:val="000000" w:themeColor="text1"/>
         </w:rPr>
+        <w:lastRenderedPageBreak/>
         <w:t>RNF-006 ARQUITECTURA CLIENTE/SERVIDOR</w:t>
       </w:r>
       <w:bookmarkEnd w:id="52"/>
@@ -21120,7 +21263,6 @@
           <w:bCs/>
           <w:color w:val="000000" w:themeColor="text1"/>
         </w:rPr>
-        <w:lastRenderedPageBreak/>
         <w:t>RNF-008 CONTROL DE ACCESOS</w:t>
       </w:r>
       <w:bookmarkEnd w:id="54"/>
@@ -21469,6 +21611,7 @@
           <w:bCs/>
           <w:color w:val="000000" w:themeColor="text1"/>
         </w:rPr>
+        <w:lastRenderedPageBreak/>
         <w:t>RNF-009 RESPALDO DE INFORMACION</w:t>
       </w:r>
       <w:bookmarkEnd w:id="55"/>
@@ -22096,7 +22239,6 @@
           <w:bCs/>
           <w:color w:val="000000" w:themeColor="text1"/>
         </w:rPr>
-        <w:lastRenderedPageBreak/>
         <w:t>RNF-011 DISPONIBILIDAD</w:t>
       </w:r>
       <w:bookmarkEnd w:id="57"/>
@@ -22414,6 +22556,7 @@
           <w:bCs/>
           <w:color w:val="000000" w:themeColor="text1"/>
         </w:rPr>
+        <w:lastRenderedPageBreak/>
         <w:t>RNF-012 USABILIDAD</w:t>
       </w:r>
       <w:bookmarkEnd w:id="58"/>
@@ -23070,462 +23213,462 @@
               <w:jc w:val="center"/>
             </w:pPr>
             <w:r>
+              <w:t>RF-006</w:t>
+            </w:r>
+          </w:p>
+        </w:tc>
+        <w:tc>
+          <w:tcPr>
+            <w:tcW w:w="3321" w:type="dxa"/>
+          </w:tcPr>
+          <w:p>
+            <w:r>
+              <w:t>Gestión de categorías</w:t>
+            </w:r>
+          </w:p>
+        </w:tc>
+        <w:tc>
+          <w:tcPr>
+            <w:tcW w:w="3321" w:type="dxa"/>
+          </w:tcPr>
+          <w:p>
+            <w:r>
+              <w:t>Clasificación de productos</w:t>
+            </w:r>
+          </w:p>
+        </w:tc>
+      </w:tr>
+      <w:tr>
+        <w:tc>
+          <w:tcPr>
+            <w:tcW w:w="3320" w:type="dxa"/>
+          </w:tcPr>
+          <w:p>
+            <w:pPr>
+              <w:jc w:val="center"/>
+            </w:pPr>
+            <w:r>
+              <w:t>RF-007</w:t>
+            </w:r>
+          </w:p>
+        </w:tc>
+        <w:tc>
+          <w:tcPr>
+            <w:tcW w:w="3321" w:type="dxa"/>
+          </w:tcPr>
+          <w:p>
+            <w:r>
+              <w:t>Gestión de productos</w:t>
+            </w:r>
+          </w:p>
+        </w:tc>
+        <w:tc>
+          <w:tcPr>
+            <w:tcW w:w="3321" w:type="dxa"/>
+          </w:tcPr>
+          <w:p>
+            <w:r>
+              <w:t>Administración de productos</w:t>
+            </w:r>
+          </w:p>
+        </w:tc>
+      </w:tr>
+      <w:tr>
+        <w:tc>
+          <w:tcPr>
+            <w:tcW w:w="3320" w:type="dxa"/>
+          </w:tcPr>
+          <w:p>
+            <w:pPr>
+              <w:jc w:val="center"/>
+            </w:pPr>
+            <w:r>
+              <w:t>RF-008</w:t>
+            </w:r>
+          </w:p>
+        </w:tc>
+        <w:tc>
+          <w:tcPr>
+            <w:tcW w:w="3321" w:type="dxa"/>
+          </w:tcPr>
+          <w:p>
+            <w:r>
+              <w:t>Registro de ventas</w:t>
+            </w:r>
+          </w:p>
+        </w:tc>
+        <w:tc>
+          <w:tcPr>
+            <w:tcW w:w="3321" w:type="dxa"/>
+          </w:tcPr>
+          <w:p>
+            <w:r>
+              <w:t>Registro de transacciones de venta</w:t>
+            </w:r>
+          </w:p>
+        </w:tc>
+      </w:tr>
+      <w:tr>
+        <w:tc>
+          <w:tcPr>
+            <w:tcW w:w="3320" w:type="dxa"/>
+          </w:tcPr>
+          <w:p>
+            <w:pPr>
+              <w:jc w:val="center"/>
+            </w:pPr>
+            <w:r>
+              <w:t>RF-009</w:t>
+            </w:r>
+          </w:p>
+        </w:tc>
+        <w:tc>
+          <w:tcPr>
+            <w:tcW w:w="3321" w:type="dxa"/>
+          </w:tcPr>
+          <w:p>
+            <w:r>
+              <w:t>Gestión de métodos de pago</w:t>
+            </w:r>
+          </w:p>
+        </w:tc>
+        <w:tc>
+          <w:tcPr>
+            <w:tcW w:w="3321" w:type="dxa"/>
+          </w:tcPr>
+          <w:p>
+            <w:r>
+              <w:t>Administración de formas de pago</w:t>
+            </w:r>
+          </w:p>
+        </w:tc>
+      </w:tr>
+      <w:tr>
+        <w:tc>
+          <w:tcPr>
+            <w:tcW w:w="3320" w:type="dxa"/>
+          </w:tcPr>
+          <w:p>
+            <w:pPr>
+              <w:jc w:val="center"/>
+            </w:pPr>
+            <w:r>
+              <w:t>RF-010</w:t>
+            </w:r>
+          </w:p>
+        </w:tc>
+        <w:tc>
+          <w:tcPr>
+            <w:tcW w:w="3321" w:type="dxa"/>
+          </w:tcPr>
+          <w:p>
+            <w:r>
+              <w:t>Apertura de caja</w:t>
+            </w:r>
+          </w:p>
+        </w:tc>
+        <w:tc>
+          <w:tcPr>
+            <w:tcW w:w="3321" w:type="dxa"/>
+          </w:tcPr>
+          <w:p>
+            <w:r>
+              <w:t>Control de inicio de turno</w:t>
+            </w:r>
+          </w:p>
+        </w:tc>
+      </w:tr>
+      <w:tr>
+        <w:tc>
+          <w:tcPr>
+            <w:tcW w:w="3320" w:type="dxa"/>
+          </w:tcPr>
+          <w:p>
+            <w:pPr>
+              <w:jc w:val="center"/>
+            </w:pPr>
+            <w:r>
+              <w:t>RF-011</w:t>
+            </w:r>
+          </w:p>
+        </w:tc>
+        <w:tc>
+          <w:tcPr>
+            <w:tcW w:w="3321" w:type="dxa"/>
+          </w:tcPr>
+          <w:p>
+            <w:r>
+              <w:t>Cierre de caja</w:t>
+            </w:r>
+          </w:p>
+        </w:tc>
+        <w:tc>
+          <w:tcPr>
+            <w:tcW w:w="3321" w:type="dxa"/>
+          </w:tcPr>
+          <w:p>
+            <w:r>
+              <w:t>Control de cierre de turno</w:t>
+            </w:r>
+          </w:p>
+        </w:tc>
+      </w:tr>
+      <w:tr>
+        <w:tc>
+          <w:tcPr>
+            <w:tcW w:w="3320" w:type="dxa"/>
+          </w:tcPr>
+          <w:p>
+            <w:pPr>
+              <w:jc w:val="center"/>
+            </w:pPr>
+            <w:r>
+              <w:t>RF-012</w:t>
+            </w:r>
+          </w:p>
+        </w:tc>
+        <w:tc>
+          <w:tcPr>
+            <w:tcW w:w="3321" w:type="dxa"/>
+          </w:tcPr>
+          <w:p>
+            <w:r>
+              <w:t>Control de inventario</w:t>
+            </w:r>
+          </w:p>
+        </w:tc>
+        <w:tc>
+          <w:tcPr>
+            <w:tcW w:w="3321" w:type="dxa"/>
+          </w:tcPr>
+          <w:p>
+            <w:r>
+              <w:t>Seguimiento de existencias</w:t>
+            </w:r>
+          </w:p>
+        </w:tc>
+      </w:tr>
+      <w:tr>
+        <w:tc>
+          <w:tcPr>
+            <w:tcW w:w="3320" w:type="dxa"/>
+          </w:tcPr>
+          <w:p>
+            <w:pPr>
+              <w:jc w:val="center"/>
+            </w:pPr>
+            <w:r>
+              <w:t>RF-013</w:t>
+            </w:r>
+          </w:p>
+        </w:tc>
+        <w:tc>
+          <w:tcPr>
+            <w:tcW w:w="3321" w:type="dxa"/>
+          </w:tcPr>
+          <w:p>
+            <w:r>
+              <w:t>Registro de mermas</w:t>
+            </w:r>
+          </w:p>
+        </w:tc>
+        <w:tc>
+          <w:tcPr>
+            <w:tcW w:w="3321" w:type="dxa"/>
+          </w:tcPr>
+          <w:p>
+            <w:r>
+              <w:t>Control de pérdidas de inventario</w:t>
+            </w:r>
+          </w:p>
+        </w:tc>
+      </w:tr>
+      <w:tr>
+        <w:tc>
+          <w:tcPr>
+            <w:tcW w:w="3320" w:type="dxa"/>
+          </w:tcPr>
+          <w:p>
+            <w:pPr>
+              <w:jc w:val="center"/>
+            </w:pPr>
+            <w:r>
+              <w:t>RF-014</w:t>
+            </w:r>
+          </w:p>
+        </w:tc>
+        <w:tc>
+          <w:tcPr>
+            <w:tcW w:w="3321" w:type="dxa"/>
+          </w:tcPr>
+          <w:p>
+            <w:r>
+              <w:t>Registro de anulación y ajustes</w:t>
+            </w:r>
+          </w:p>
+        </w:tc>
+        <w:tc>
+          <w:tcPr>
+            <w:tcW w:w="3321" w:type="dxa"/>
+          </w:tcPr>
+          <w:p>
+            <w:r>
+              <w:t>Corrección de operaciones</w:t>
+            </w:r>
+          </w:p>
+        </w:tc>
+      </w:tr>
+      <w:tr>
+        <w:tc>
+          <w:tcPr>
+            <w:tcW w:w="3320" w:type="dxa"/>
+          </w:tcPr>
+          <w:p>
+            <w:pPr>
+              <w:jc w:val="center"/>
+            </w:pPr>
+            <w:r>
+              <w:t>RF-015</w:t>
+            </w:r>
+          </w:p>
+        </w:tc>
+        <w:tc>
+          <w:tcPr>
+            <w:tcW w:w="3321" w:type="dxa"/>
+          </w:tcPr>
+          <w:p>
+            <w:r>
+              <w:t>Reportes operativos</w:t>
+            </w:r>
+          </w:p>
+        </w:tc>
+        <w:tc>
+          <w:tcPr>
+            <w:tcW w:w="3321" w:type="dxa"/>
+          </w:tcPr>
+          <w:p>
+            <w:r>
+              <w:t>Consulta y análisis de información</w:t>
+            </w:r>
+          </w:p>
+        </w:tc>
+      </w:tr>
+      <w:tr>
+        <w:tc>
+          <w:tcPr>
+            <w:tcW w:w="3320" w:type="dxa"/>
+          </w:tcPr>
+          <w:p>
+            <w:pPr>
+              <w:jc w:val="center"/>
+            </w:pPr>
+            <w:r>
+              <w:t>RF-016</w:t>
+            </w:r>
+          </w:p>
+        </w:tc>
+        <w:tc>
+          <w:tcPr>
+            <w:tcW w:w="3321" w:type="dxa"/>
+          </w:tcPr>
+          <w:p>
+            <w:r>
+              <w:t>Dashboard gerencial</w:t>
+            </w:r>
+          </w:p>
+        </w:tc>
+        <w:tc>
+          <w:tcPr>
+            <w:tcW w:w="3321" w:type="dxa"/>
+          </w:tcPr>
+          <w:p>
+            <w:r>
+              <w:t>Indicadores para toma de decisiones</w:t>
+            </w:r>
+          </w:p>
+        </w:tc>
+      </w:tr>
+      <w:tr>
+        <w:tc>
+          <w:tcPr>
+            <w:tcW w:w="3320" w:type="dxa"/>
+          </w:tcPr>
+          <w:p>
+            <w:pPr>
+              <w:jc w:val="center"/>
+            </w:pPr>
+            <w:r>
+              <w:t>RF-017</w:t>
+            </w:r>
+          </w:p>
+        </w:tc>
+        <w:tc>
+          <w:tcPr>
+            <w:tcW w:w="3321" w:type="dxa"/>
+          </w:tcPr>
+          <w:p>
+            <w:r>
+              <w:t>Bitácora de ingresos</w:t>
+            </w:r>
+          </w:p>
+        </w:tc>
+        <w:tc>
+          <w:tcPr>
+            <w:tcW w:w="3321" w:type="dxa"/>
+          </w:tcPr>
+          <w:p>
+            <w:r>
+              <w:t>Auditoria de accesos</w:t>
+            </w:r>
+          </w:p>
+        </w:tc>
+      </w:tr>
+      <w:tr>
+        <w:tc>
+          <w:tcPr>
+            <w:tcW w:w="3320" w:type="dxa"/>
+          </w:tcPr>
+          <w:p>
+            <w:pPr>
+              <w:jc w:val="center"/>
+            </w:pPr>
+            <w:r>
+              <w:t>RF-018</w:t>
+            </w:r>
+          </w:p>
+        </w:tc>
+        <w:tc>
+          <w:tcPr>
+            <w:tcW w:w="3321" w:type="dxa"/>
+          </w:tcPr>
+          <w:p>
+            <w:r>
+              <w:t>Bitácora de movimientos</w:t>
+            </w:r>
+          </w:p>
+        </w:tc>
+        <w:tc>
+          <w:tcPr>
+            <w:tcW w:w="3321" w:type="dxa"/>
+          </w:tcPr>
+          <w:p>
+            <w:r>
+              <w:t>Auditoria de acciones realizadas</w:t>
+            </w:r>
+          </w:p>
+        </w:tc>
+      </w:tr>
+      <w:tr>
+        <w:tc>
+          <w:tcPr>
+            <w:tcW w:w="3320" w:type="dxa"/>
+          </w:tcPr>
+          <w:p>
+            <w:pPr>
+              <w:jc w:val="center"/>
+            </w:pPr>
+            <w:r>
               <w:lastRenderedPageBreak/>
-              <w:t>RF-006</w:t>
-            </w:r>
-          </w:p>
-        </w:tc>
-        <w:tc>
-          <w:tcPr>
-            <w:tcW w:w="3321" w:type="dxa"/>
-          </w:tcPr>
-          <w:p>
-            <w:r>
-              <w:t>Gestión de categorías</w:t>
-            </w:r>
-          </w:p>
-        </w:tc>
-        <w:tc>
-          <w:tcPr>
-            <w:tcW w:w="3321" w:type="dxa"/>
-          </w:tcPr>
-          <w:p>
-            <w:r>
-              <w:t>Clasificación de productos</w:t>
-            </w:r>
-          </w:p>
-        </w:tc>
-      </w:tr>
-      <w:tr>
-        <w:tc>
-          <w:tcPr>
-            <w:tcW w:w="3320" w:type="dxa"/>
-          </w:tcPr>
-          <w:p>
-            <w:pPr>
-              <w:jc w:val="center"/>
-            </w:pPr>
-            <w:r>
-              <w:t>RF-007</w:t>
-            </w:r>
-          </w:p>
-        </w:tc>
-        <w:tc>
-          <w:tcPr>
-            <w:tcW w:w="3321" w:type="dxa"/>
-          </w:tcPr>
-          <w:p>
-            <w:r>
-              <w:t>Gestión de productos</w:t>
-            </w:r>
-          </w:p>
-        </w:tc>
-        <w:tc>
-          <w:tcPr>
-            <w:tcW w:w="3321" w:type="dxa"/>
-          </w:tcPr>
-          <w:p>
-            <w:r>
-              <w:t>Administración de productos</w:t>
-            </w:r>
-          </w:p>
-        </w:tc>
-      </w:tr>
-      <w:tr>
-        <w:tc>
-          <w:tcPr>
-            <w:tcW w:w="3320" w:type="dxa"/>
-          </w:tcPr>
-          <w:p>
-            <w:pPr>
-              <w:jc w:val="center"/>
-            </w:pPr>
-            <w:r>
-              <w:t>RF-008</w:t>
-            </w:r>
-          </w:p>
-        </w:tc>
-        <w:tc>
-          <w:tcPr>
-            <w:tcW w:w="3321" w:type="dxa"/>
-          </w:tcPr>
-          <w:p>
-            <w:r>
-              <w:t>Registro de ventas</w:t>
-            </w:r>
-          </w:p>
-        </w:tc>
-        <w:tc>
-          <w:tcPr>
-            <w:tcW w:w="3321" w:type="dxa"/>
-          </w:tcPr>
-          <w:p>
-            <w:r>
-              <w:t>Registro de transacciones de venta</w:t>
-            </w:r>
-          </w:p>
-        </w:tc>
-      </w:tr>
-      <w:tr>
-        <w:tc>
-          <w:tcPr>
-            <w:tcW w:w="3320" w:type="dxa"/>
-          </w:tcPr>
-          <w:p>
-            <w:pPr>
-              <w:jc w:val="center"/>
-            </w:pPr>
-            <w:r>
-              <w:t>RF-009</w:t>
-            </w:r>
-          </w:p>
-        </w:tc>
-        <w:tc>
-          <w:tcPr>
-            <w:tcW w:w="3321" w:type="dxa"/>
-          </w:tcPr>
-          <w:p>
-            <w:r>
-              <w:t>Gestión de métodos de pago</w:t>
-            </w:r>
-          </w:p>
-        </w:tc>
-        <w:tc>
-          <w:tcPr>
-            <w:tcW w:w="3321" w:type="dxa"/>
-          </w:tcPr>
-          <w:p>
-            <w:r>
-              <w:t>Administración de formas de pago</w:t>
-            </w:r>
-          </w:p>
-        </w:tc>
-      </w:tr>
-      <w:tr>
-        <w:tc>
-          <w:tcPr>
-            <w:tcW w:w="3320" w:type="dxa"/>
-          </w:tcPr>
-          <w:p>
-            <w:pPr>
-              <w:jc w:val="center"/>
-            </w:pPr>
-            <w:r>
-              <w:t>RF-010</w:t>
-            </w:r>
-          </w:p>
-        </w:tc>
-        <w:tc>
-          <w:tcPr>
-            <w:tcW w:w="3321" w:type="dxa"/>
-          </w:tcPr>
-          <w:p>
-            <w:r>
-              <w:t>Apertura de caja</w:t>
-            </w:r>
-          </w:p>
-        </w:tc>
-        <w:tc>
-          <w:tcPr>
-            <w:tcW w:w="3321" w:type="dxa"/>
-          </w:tcPr>
-          <w:p>
-            <w:r>
-              <w:t>Control de inicio de turno</w:t>
-            </w:r>
-          </w:p>
-        </w:tc>
-      </w:tr>
-      <w:tr>
-        <w:tc>
-          <w:tcPr>
-            <w:tcW w:w="3320" w:type="dxa"/>
-          </w:tcPr>
-          <w:p>
-            <w:pPr>
-              <w:jc w:val="center"/>
-            </w:pPr>
-            <w:r>
-              <w:t>RF-011</w:t>
-            </w:r>
-          </w:p>
-        </w:tc>
-        <w:tc>
-          <w:tcPr>
-            <w:tcW w:w="3321" w:type="dxa"/>
-          </w:tcPr>
-          <w:p>
-            <w:r>
-              <w:t>Cierre de caja</w:t>
-            </w:r>
-          </w:p>
-        </w:tc>
-        <w:tc>
-          <w:tcPr>
-            <w:tcW w:w="3321" w:type="dxa"/>
-          </w:tcPr>
-          <w:p>
-            <w:r>
-              <w:t>Control de cierre de turno</w:t>
-            </w:r>
-          </w:p>
-        </w:tc>
-      </w:tr>
-      <w:tr>
-        <w:tc>
-          <w:tcPr>
-            <w:tcW w:w="3320" w:type="dxa"/>
-          </w:tcPr>
-          <w:p>
-            <w:pPr>
-              <w:jc w:val="center"/>
-            </w:pPr>
-            <w:r>
-              <w:t>RF-012</w:t>
-            </w:r>
-          </w:p>
-        </w:tc>
-        <w:tc>
-          <w:tcPr>
-            <w:tcW w:w="3321" w:type="dxa"/>
-          </w:tcPr>
-          <w:p>
-            <w:r>
-              <w:t>Control de inventario</w:t>
-            </w:r>
-          </w:p>
-        </w:tc>
-        <w:tc>
-          <w:tcPr>
-            <w:tcW w:w="3321" w:type="dxa"/>
-          </w:tcPr>
-          <w:p>
-            <w:r>
-              <w:t>Seguimiento de existencias</w:t>
-            </w:r>
-          </w:p>
-        </w:tc>
-      </w:tr>
-      <w:tr>
-        <w:tc>
-          <w:tcPr>
-            <w:tcW w:w="3320" w:type="dxa"/>
-          </w:tcPr>
-          <w:p>
-            <w:pPr>
-              <w:jc w:val="center"/>
-            </w:pPr>
-            <w:r>
-              <w:t>RF-013</w:t>
-            </w:r>
-          </w:p>
-        </w:tc>
-        <w:tc>
-          <w:tcPr>
-            <w:tcW w:w="3321" w:type="dxa"/>
-          </w:tcPr>
-          <w:p>
-            <w:r>
-              <w:t>Registro de mermas</w:t>
-            </w:r>
-          </w:p>
-        </w:tc>
-        <w:tc>
-          <w:tcPr>
-            <w:tcW w:w="3321" w:type="dxa"/>
-          </w:tcPr>
-          <w:p>
-            <w:r>
-              <w:t>Control de pérdidas de inventario</w:t>
-            </w:r>
-          </w:p>
-        </w:tc>
-      </w:tr>
-      <w:tr>
-        <w:tc>
-          <w:tcPr>
-            <w:tcW w:w="3320" w:type="dxa"/>
-          </w:tcPr>
-          <w:p>
-            <w:pPr>
-              <w:jc w:val="center"/>
-            </w:pPr>
-            <w:r>
-              <w:t>RF-014</w:t>
-            </w:r>
-          </w:p>
-        </w:tc>
-        <w:tc>
-          <w:tcPr>
-            <w:tcW w:w="3321" w:type="dxa"/>
-          </w:tcPr>
-          <w:p>
-            <w:r>
-              <w:t>Registro de anulación y ajustes</w:t>
-            </w:r>
-          </w:p>
-        </w:tc>
-        <w:tc>
-          <w:tcPr>
-            <w:tcW w:w="3321" w:type="dxa"/>
-          </w:tcPr>
-          <w:p>
-            <w:r>
-              <w:t>Corrección de operaciones</w:t>
-            </w:r>
-          </w:p>
-        </w:tc>
-      </w:tr>
-      <w:tr>
-        <w:tc>
-          <w:tcPr>
-            <w:tcW w:w="3320" w:type="dxa"/>
-          </w:tcPr>
-          <w:p>
-            <w:pPr>
-              <w:jc w:val="center"/>
-            </w:pPr>
-            <w:r>
-              <w:t>RF-015</w:t>
-            </w:r>
-          </w:p>
-        </w:tc>
-        <w:tc>
-          <w:tcPr>
-            <w:tcW w:w="3321" w:type="dxa"/>
-          </w:tcPr>
-          <w:p>
-            <w:r>
-              <w:t>Reportes operativos</w:t>
-            </w:r>
-          </w:p>
-        </w:tc>
-        <w:tc>
-          <w:tcPr>
-            <w:tcW w:w="3321" w:type="dxa"/>
-          </w:tcPr>
-          <w:p>
-            <w:r>
-              <w:t>Consulta y análisis de información</w:t>
-            </w:r>
-          </w:p>
-        </w:tc>
-      </w:tr>
-      <w:tr>
-        <w:tc>
-          <w:tcPr>
-            <w:tcW w:w="3320" w:type="dxa"/>
-          </w:tcPr>
-          <w:p>
-            <w:pPr>
-              <w:jc w:val="center"/>
-            </w:pPr>
-            <w:r>
-              <w:t>RF-016</w:t>
-            </w:r>
-          </w:p>
-        </w:tc>
-        <w:tc>
-          <w:tcPr>
-            <w:tcW w:w="3321" w:type="dxa"/>
-          </w:tcPr>
-          <w:p>
-            <w:r>
-              <w:t>Dashboard gerencial</w:t>
-            </w:r>
-          </w:p>
-        </w:tc>
-        <w:tc>
-          <w:tcPr>
-            <w:tcW w:w="3321" w:type="dxa"/>
-          </w:tcPr>
-          <w:p>
-            <w:r>
-              <w:t>Indicadores para toma de decisiones</w:t>
-            </w:r>
-          </w:p>
-        </w:tc>
-      </w:tr>
-      <w:tr>
-        <w:tc>
-          <w:tcPr>
-            <w:tcW w:w="3320" w:type="dxa"/>
-          </w:tcPr>
-          <w:p>
-            <w:pPr>
-              <w:jc w:val="center"/>
-            </w:pPr>
-            <w:r>
-              <w:t>RF-017</w:t>
-            </w:r>
-          </w:p>
-        </w:tc>
-        <w:tc>
-          <w:tcPr>
-            <w:tcW w:w="3321" w:type="dxa"/>
-          </w:tcPr>
-          <w:p>
-            <w:r>
-              <w:t>Bitácora de ingresos</w:t>
-            </w:r>
-          </w:p>
-        </w:tc>
-        <w:tc>
-          <w:tcPr>
-            <w:tcW w:w="3321" w:type="dxa"/>
-          </w:tcPr>
-          <w:p>
-            <w:r>
-              <w:t>Auditoria de accesos</w:t>
-            </w:r>
-          </w:p>
-        </w:tc>
-      </w:tr>
-      <w:tr>
-        <w:tc>
-          <w:tcPr>
-            <w:tcW w:w="3320" w:type="dxa"/>
-          </w:tcPr>
-          <w:p>
-            <w:pPr>
-              <w:jc w:val="center"/>
-            </w:pPr>
-            <w:r>
-              <w:t>RF-018</w:t>
-            </w:r>
-          </w:p>
-        </w:tc>
-        <w:tc>
-          <w:tcPr>
-            <w:tcW w:w="3321" w:type="dxa"/>
-          </w:tcPr>
-          <w:p>
-            <w:r>
-              <w:t>Bitácora de movimientos</w:t>
-            </w:r>
-          </w:p>
-        </w:tc>
-        <w:tc>
-          <w:tcPr>
-            <w:tcW w:w="3321" w:type="dxa"/>
-          </w:tcPr>
-          <w:p>
-            <w:r>
-              <w:t>Auditoria de acciones realizadas</w:t>
-            </w:r>
-          </w:p>
-        </w:tc>
-      </w:tr>
-      <w:tr>
-        <w:tc>
-          <w:tcPr>
-            <w:tcW w:w="3320" w:type="dxa"/>
-          </w:tcPr>
-          <w:p>
-            <w:pPr>
-              <w:jc w:val="center"/>
-            </w:pPr>
-            <w:r>
               <w:t>RF-019</w:t>
             </w:r>
           </w:p>
@@ -25585,7 +25728,7 @@
   <w:abstractNum w:abstractNumId="10" w15:restartNumberingAfterBreak="0">
     <w:nsid w:val="0F5B3F41"/>
     <w:multiLevelType w:val="multilevel"/>
-    <w:tmpl w:val="F50EA9FE"/>
+    <w:tmpl w:val="19D8D278"/>
     <w:lvl w:ilvl="0">
       <w:start w:val="1"/>
       <w:numFmt w:val="decimal"/>
@@ -25611,6 +25754,8 @@
         <w:rFonts w:hint="default"/>
         <w:b/>
         <w:bCs/>
+        <w:sz w:val="24"/>
+        <w:szCs w:val="24"/>
       </w:rPr>
     </w:lvl>
     <w:lvl w:ilvl="2">
@@ -28281,6 +28426,119 @@
     </w:lvl>
   </w:abstractNum>
   <w:abstractNum w:abstractNumId="34" w15:restartNumberingAfterBreak="0">
+    <w:nsid w:val="6D4D017A"/>
+    <w:multiLevelType w:val="hybridMultilevel"/>
+    <w:tmpl w:val="C7E63DB2"/>
+    <w:lvl w:ilvl="0" w:tplc="140A0001">
+      <w:start w:val="1"/>
+      <w:numFmt w:val="bullet"/>
+      <w:lvlText w:val=""/>
+      <w:lvlJc w:val="left"/>
+      <w:pPr>
+        <w:ind w:left="1080" w:hanging="360"/>
+      </w:pPr>
+      <w:rPr>
+        <w:rFonts w:ascii="Symbol" w:hAnsi="Symbol" w:hint="default"/>
+      </w:rPr>
+    </w:lvl>
+    <w:lvl w:ilvl="1" w:tplc="140A0003" w:tentative="1">
+      <w:start w:val="1"/>
+      <w:numFmt w:val="bullet"/>
+      <w:lvlText w:val="o"/>
+      <w:lvlJc w:val="left"/>
+      <w:pPr>
+        <w:ind w:left="1800" w:hanging="360"/>
+      </w:pPr>
+      <w:rPr>
+        <w:rFonts w:ascii="Courier New" w:hAnsi="Courier New" w:cs="Courier New" w:hint="default"/>
+      </w:rPr>
+    </w:lvl>
+    <w:lvl w:ilvl="2" w:tplc="140A0005" w:tentative="1">
+      <w:start w:val="1"/>
+      <w:numFmt w:val="bullet"/>
+      <w:lvlText w:val=""/>
+      <w:lvlJc w:val="left"/>
+      <w:pPr>
+        <w:ind w:left="2520" w:hanging="360"/>
+      </w:pPr>
+      <w:rPr>
+        <w:rFonts w:ascii="Wingdings" w:hAnsi="Wingdings" w:hint="default"/>
+      </w:rPr>
+    </w:lvl>
+    <w:lvl w:ilvl="3" w:tplc="140A0001" w:tentative="1">
+      <w:start w:val="1"/>
+      <w:numFmt w:val="bullet"/>
+      <w:lvlText w:val=""/>
+      <w:lvlJc w:val="left"/>
+      <w:pPr>
+        <w:ind w:left="3240" w:hanging="360"/>
+      </w:pPr>
+      <w:rPr>
+        <w:rFonts w:ascii="Symbol" w:hAnsi="Symbol" w:hint="default"/>
+      </w:rPr>
+    </w:lvl>
+    <w:lvl w:ilvl="4" w:tplc="140A0003" w:tentative="1">
+      <w:start w:val="1"/>
+      <w:numFmt w:val="bullet"/>
+      <w:lvlText w:val="o"/>
+      <w:lvlJc w:val="left"/>
+      <w:pPr>
+        <w:ind w:left="3960" w:hanging="360"/>
+      </w:pPr>
+      <w:rPr>
+        <w:rFonts w:ascii="Courier New" w:hAnsi="Courier New" w:cs="Courier New" w:hint="default"/>
+      </w:rPr>
+    </w:lvl>
+    <w:lvl w:ilvl="5" w:tplc="140A0005" w:tentative="1">
+      <w:start w:val="1"/>
+      <w:numFmt w:val="bullet"/>
+      <w:lvlText w:val=""/>
+      <w:lvlJc w:val="left"/>
+      <w:pPr>
+        <w:ind w:left="4680" w:hanging="360"/>
+      </w:pPr>
+      <w:rPr>
+        <w:rFonts w:ascii="Wingdings" w:hAnsi="Wingdings" w:hint="default"/>
+      </w:rPr>
+    </w:lvl>
+    <w:lvl w:ilvl="6" w:tplc="140A0001" w:tentative="1">
+      <w:start w:val="1"/>
+      <w:numFmt w:val="bullet"/>
+      <w:lvlText w:val=""/>
+      <w:lvlJc w:val="left"/>
+      <w:pPr>
+        <w:ind w:left="5400" w:hanging="360"/>
+      </w:pPr>
+      <w:rPr>
+        <w:rFonts w:ascii="Symbol" w:hAnsi="Symbol" w:hint="default"/>
+      </w:rPr>
+    </w:lvl>
+    <w:lvl w:ilvl="7" w:tplc="140A0003" w:tentative="1">
+      <w:start w:val="1"/>
+      <w:numFmt w:val="bullet"/>
+      <w:lvlText w:val="o"/>
+      <w:lvlJc w:val="left"/>
+      <w:pPr>
+        <w:ind w:left="6120" w:hanging="360"/>
+      </w:pPr>
+      <w:rPr>
+        <w:rFonts w:ascii="Courier New" w:hAnsi="Courier New" w:cs="Courier New" w:hint="default"/>
+      </w:rPr>
+    </w:lvl>
+    <w:lvl w:ilvl="8" w:tplc="140A0005" w:tentative="1">
+      <w:start w:val="1"/>
+      <w:numFmt w:val="bullet"/>
+      <w:lvlText w:val=""/>
+      <w:lvlJc w:val="left"/>
+      <w:pPr>
+        <w:ind w:left="6840" w:hanging="360"/>
+      </w:pPr>
+      <w:rPr>
+        <w:rFonts w:ascii="Wingdings" w:hAnsi="Wingdings" w:hint="default"/>
+      </w:rPr>
+    </w:lvl>
+  </w:abstractNum>
+  <w:abstractNum w:abstractNumId="35" w15:restartNumberingAfterBreak="0">
     <w:nsid w:val="6F0F6B40"/>
     <w:multiLevelType w:val="multilevel"/>
     <w:tmpl w:val="4F748B32"/>
@@ -28394,7 +28652,7 @@
       </w:rPr>
     </w:lvl>
   </w:abstractNum>
-  <w:abstractNum w:abstractNumId="35" w15:restartNumberingAfterBreak="0">
+  <w:abstractNum w:abstractNumId="36" w15:restartNumberingAfterBreak="0">
     <w:nsid w:val="6F391E6C"/>
     <w:multiLevelType w:val="hybridMultilevel"/>
     <w:tmpl w:val="898C575E"/>
@@ -28480,7 +28738,7 @@
       </w:pPr>
     </w:lvl>
   </w:abstractNum>
-  <w:abstractNum w:abstractNumId="36" w15:restartNumberingAfterBreak="0">
+  <w:abstractNum w:abstractNumId="37" w15:restartNumberingAfterBreak="0">
     <w:nsid w:val="70FA73D7"/>
     <w:multiLevelType w:val="multilevel"/>
     <w:tmpl w:val="1E96A36C"/>
@@ -28597,7 +28855,7 @@
       </w:rPr>
     </w:lvl>
   </w:abstractNum>
-  <w:abstractNum w:abstractNumId="37" w15:restartNumberingAfterBreak="0">
+  <w:abstractNum w:abstractNumId="38" w15:restartNumberingAfterBreak="0">
     <w:nsid w:val="71F05250"/>
     <w:multiLevelType w:val="multilevel"/>
     <w:tmpl w:val="7602C5FA"/>
@@ -28714,7 +28972,7 @@
       </w:rPr>
     </w:lvl>
   </w:abstractNum>
-  <w:abstractNum w:abstractNumId="38" w15:restartNumberingAfterBreak="0">
+  <w:abstractNum w:abstractNumId="39" w15:restartNumberingAfterBreak="0">
     <w:nsid w:val="72A73F7C"/>
     <w:multiLevelType w:val="multilevel"/>
     <w:tmpl w:val="7F021658"/>
@@ -28827,7 +29085,7 @@
       </w:rPr>
     </w:lvl>
   </w:abstractNum>
-  <w:abstractNum w:abstractNumId="39" w15:restartNumberingAfterBreak="0">
+  <w:abstractNum w:abstractNumId="40" w15:restartNumberingAfterBreak="0">
     <w:nsid w:val="79574FD5"/>
     <w:multiLevelType w:val="hybridMultilevel"/>
     <w:tmpl w:val="7FFE976C"/>
@@ -28916,7 +29174,7 @@
       </w:pPr>
     </w:lvl>
   </w:abstractNum>
-  <w:abstractNum w:abstractNumId="40" w15:restartNumberingAfterBreak="0">
+  <w:abstractNum w:abstractNumId="41" w15:restartNumberingAfterBreak="0">
     <w:nsid w:val="7A5139C2"/>
     <w:multiLevelType w:val="multilevel"/>
     <w:tmpl w:val="056AF956"/>
@@ -29033,7 +29291,7 @@
       </w:rPr>
     </w:lvl>
   </w:abstractNum>
-  <w:abstractNum w:abstractNumId="41" w15:restartNumberingAfterBreak="0">
+  <w:abstractNum w:abstractNumId="42" w15:restartNumberingAfterBreak="0">
     <w:nsid w:val="7E8D4AF5"/>
     <w:multiLevelType w:val="hybridMultilevel"/>
     <w:tmpl w:val="B84CB220"/>
@@ -29146,7 +29404,7 @@
       </w:rPr>
     </w:lvl>
   </w:abstractNum>
-  <w:abstractNum w:abstractNumId="42" w15:restartNumberingAfterBreak="0">
+  <w:abstractNum w:abstractNumId="43" w15:restartNumberingAfterBreak="0">
     <w:nsid w:val="7F936FFE"/>
     <w:multiLevelType w:val="hybridMultilevel"/>
     <w:tmpl w:val="4E740F88"/>
@@ -29239,7 +29497,7 @@
     <w:abstractNumId w:val="16"/>
   </w:num>
   <w:num w:numId="3">
-    <w:abstractNumId w:val="40"/>
+    <w:abstractNumId w:val="41"/>
   </w:num>
   <w:num w:numId="4">
     <w:abstractNumId w:val="21"/>
@@ -29251,7 +29509,7 @@
     <w:abstractNumId w:val="25"/>
   </w:num>
   <w:num w:numId="7">
-    <w:abstractNumId w:val="41"/>
+    <w:abstractNumId w:val="42"/>
   </w:num>
   <w:num w:numId="8">
     <w:abstractNumId w:val="13"/>
@@ -29266,7 +29524,7 @@
     <w:abstractNumId w:val="6"/>
   </w:num>
   <w:num w:numId="12">
-    <w:abstractNumId w:val="36"/>
+    <w:abstractNumId w:val="37"/>
   </w:num>
   <w:num w:numId="13">
     <w:abstractNumId w:val="29"/>
@@ -29287,7 +29545,7 @@
     <w:abstractNumId w:val="27"/>
   </w:num>
   <w:num w:numId="19">
-    <w:abstractNumId w:val="42"/>
+    <w:abstractNumId w:val="43"/>
   </w:num>
   <w:num w:numId="20">
     <w:abstractNumId w:val="14"/>
@@ -29299,7 +29557,7 @@
     <w:abstractNumId w:val="31"/>
   </w:num>
   <w:num w:numId="23">
-    <w:abstractNumId w:val="38"/>
+    <w:abstractNumId w:val="39"/>
   </w:num>
   <w:num w:numId="24">
     <w:abstractNumId w:val="30"/>
@@ -29323,19 +29581,19 @@
     <w:abstractNumId w:val="23"/>
   </w:num>
   <w:num w:numId="31">
-    <w:abstractNumId w:val="37"/>
+    <w:abstractNumId w:val="38"/>
   </w:num>
   <w:num w:numId="32">
     <w:abstractNumId w:val="17"/>
   </w:num>
   <w:num w:numId="33">
-    <w:abstractNumId w:val="39"/>
+    <w:abstractNumId w:val="40"/>
   </w:num>
   <w:num w:numId="34">
     <w:abstractNumId w:val="10"/>
   </w:num>
   <w:num w:numId="35">
-    <w:abstractNumId w:val="35"/>
+    <w:abstractNumId w:val="36"/>
   </w:num>
   <w:num w:numId="36">
     <w:abstractNumId w:val="4"/>
@@ -29344,10 +29602,10 @@
     <w:abstractNumId w:val="22"/>
   </w:num>
   <w:num w:numId="38">
-    <w:abstractNumId w:val="34"/>
+    <w:abstractNumId w:val="35"/>
   </w:num>
   <w:num w:numId="39">
-    <w:abstractNumId w:val="34"/>
+    <w:abstractNumId w:val="35"/>
   </w:num>
   <w:num w:numId="40">
     <w:abstractNumId w:val="26"/>
@@ -29363,6 +29621,9 @@
   </w:num>
   <w:num w:numId="44">
     <w:abstractNumId w:val="7"/>
+  </w:num>
+  <w:num w:numId="45">
+    <w:abstractNumId w:val="34"/>
   </w:num>
 </w:numbering>
 </file>

</xml_diff>